<commit_message>
Updated for hotfix 2
</commit_message>
<xml_diff>
--- a/WalkscapeCollectorsEdition.docx
+++ b/WalkscapeCollectorsEdition.docx
@@ -373,7 +373,7 @@
           <w:rFonts w:ascii="Calibri" w:cs="Calibri" w:eastAsia="Calibri" w:hAnsi="Calibri"/>
           <w:rtl w:val="0"/>
         </w:rPr>
-        <w:t xml:space="preserve">Sturdy Fishing Rod Rest (Fishing Chests) -&gt; Comfy Fishing Chair</w:t>
+        <w:t xml:space="preserve">Sturdy Fishing Rod Rest (Fishing Chests) -&gt; Triple Rod Rest</w:t>
       </w:r>
     </w:p>
     <w:p>
@@ -3571,7 +3571,7 @@
           <w:bCs w:val="1"/>
           <w:rtl w:val="0"/>
         </w:rPr>
-        <w:t xml:space="preserve">Tailoring</w:t>
+        <w:t xml:space="preserve">Quality Outcome Tailoring</w:t>
       </w:r>
       <w:r>
         <w:rPr>
@@ -3627,50 +3627,48 @@
           <w:ilvl w:val="0"/>
           <w:numId w:val="14"/>
         </w:numPr>
-        <w:spacing w:after="160" w:line="259" w:lineRule="auto"/>
-        <w:ind w:left="720" w:hanging="360"/>
-        <w:rPr>
-          <w:rFonts w:ascii="Noto Sans Symbols" w:cs="Noto Sans Symbols" w:eastAsia="Noto Sans Symbols" w:hAnsi="Noto Sans Symbols"/>
-        </w:rPr>
-      </w:pPr>
-      <w:r>
-        <w:rPr>
-          <w:rFonts w:ascii="Calibri" w:cs="Calibri" w:eastAsia="Calibri" w:hAnsi="Calibri"/>
-          <w:rtl w:val="0"/>
-        </w:rPr>
-        <w:t xml:space="preserve">Return to Kallaheim, bank everything, get your best </w:t>
-      </w:r>
-      <w:r>
-        <w:rPr>
-          <w:rFonts w:ascii="Calibri" w:cs="Calibri" w:eastAsia="Calibri" w:hAnsi="Calibri"/>
-          <w:b w:val="1"/>
-          <w:bCs w:val="1"/>
-          <w:rtl w:val="0"/>
-        </w:rPr>
-        <w:t xml:space="preserve">Rod Fishing</w:t>
-      </w:r>
-      <w:r>
-        <w:rPr>
-          <w:rFonts w:ascii="Calibri" w:cs="Calibri" w:eastAsia="Calibri" w:hAnsi="Calibri"/>
-          <w:rtl w:val="0"/>
-        </w:rPr>
-        <w:t xml:space="preserve"> and </w:t>
-      </w:r>
-      <w:r>
-        <w:rPr>
-          <w:rFonts w:ascii="Calibri" w:cs="Calibri" w:eastAsia="Calibri" w:hAnsi="Calibri"/>
-          <w:b w:val="1"/>
-          <w:bCs w:val="1"/>
-          <w:rtl w:val="0"/>
-        </w:rPr>
-        <w:t xml:space="preserve">Crafting</w:t>
-      </w:r>
-      <w:r>
-        <w:rPr>
-          <w:rFonts w:ascii="Calibri" w:cs="Calibri" w:eastAsia="Calibri" w:hAnsi="Calibri"/>
-          <w:rtl w:val="0"/>
-        </w:rPr>
-        <w:t xml:space="preserve"> gear.</w:t>
+        <w:spacing w:line="259" w:lineRule="auto"/>
+        <w:ind w:left="720" w:hanging="360"/>
+        <w:rPr>
+          <w:rFonts w:ascii="Calibri" w:cs="Calibri" w:eastAsia="Calibri" w:hAnsi="Calibri"/>
+          <w:u w:val="none"/>
+        </w:rPr>
+      </w:pPr>
+      <w:r>
+        <w:rPr>
+          <w:rFonts w:ascii="Calibri" w:cs="Calibri" w:eastAsia="Calibri" w:hAnsi="Calibri"/>
+          <w:rtl w:val="0"/>
+        </w:rPr>
+        <w:t xml:space="preserve">Return to Kallaheim and if you have any leftover Leather and Spruce Logs/Planks, using your best </w:t>
+      </w:r>
+      <w:r>
+        <w:rPr>
+          <w:rFonts w:ascii="Calibri" w:cs="Calibri" w:eastAsia="Calibri" w:hAnsi="Calibri"/>
+          <w:b w:val="1"/>
+          <w:bCs w:val="1"/>
+          <w:rtl w:val="0"/>
+        </w:rPr>
+        <w:t xml:space="preserve">Quality Outcome Carpentry</w:t>
+      </w:r>
+      <w:r>
+        <w:rPr>
+          <w:rFonts w:ascii="Calibri" w:cs="Calibri" w:eastAsia="Calibri" w:hAnsi="Calibri"/>
+          <w:rtl w:val="0"/>
+        </w:rPr>
+        <w:t xml:space="preserve"> gear create the best Comfy Fishing Chair that you can.</w:t>
+      </w:r>
+    </w:p>
+    <w:p>
+      <w:pPr>
+        <w:spacing w:line="259" w:lineRule="auto"/>
+        <w:rPr>
+          <w:rFonts w:ascii="Calibri" w:cs="Calibri" w:eastAsia="Calibri" w:hAnsi="Calibri"/>
+        </w:rPr>
+      </w:pPr>
+      <w:r>
+        <w:rPr>
+          <w:rtl w:val="0"/>
+        </w:rPr>
       </w:r>
     </w:p>
     <w:p>
@@ -3754,7 +3752,39 @@
           <w:rFonts w:ascii="Calibri" w:cs="Calibri" w:eastAsia="Calibri" w:hAnsi="Calibri"/>
           <w:rtl w:val="0"/>
         </w:rPr>
-        <w:t xml:space="preserve">Go to Frusenholm and do Ice Sculpting for the </w:t>
+        <w:t xml:space="preserve">Get your best </w:t>
+      </w:r>
+      <w:r>
+        <w:rPr>
+          <w:rFonts w:ascii="Calibri" w:cs="Calibri" w:eastAsia="Calibri" w:hAnsi="Calibri"/>
+          <w:b w:val="1"/>
+          <w:bCs w:val="1"/>
+          <w:rtl w:val="0"/>
+        </w:rPr>
+        <w:t xml:space="preserve">Rod Fishing</w:t>
+      </w:r>
+      <w:r>
+        <w:rPr>
+          <w:rFonts w:ascii="Calibri" w:cs="Calibri" w:eastAsia="Calibri" w:hAnsi="Calibri"/>
+          <w:rtl w:val="0"/>
+        </w:rPr>
+        <w:t xml:space="preserve"> and </w:t>
+      </w:r>
+      <w:r>
+        <w:rPr>
+          <w:rFonts w:ascii="Calibri" w:cs="Calibri" w:eastAsia="Calibri" w:hAnsi="Calibri"/>
+          <w:b w:val="1"/>
+          <w:bCs w:val="1"/>
+          <w:rtl w:val="0"/>
+        </w:rPr>
+        <w:t xml:space="preserve">Crafting</w:t>
+      </w:r>
+      <w:r>
+        <w:rPr>
+          <w:rFonts w:ascii="Calibri" w:cs="Calibri" w:eastAsia="Calibri" w:hAnsi="Calibri"/>
+          <w:rtl w:val="0"/>
+        </w:rPr>
+        <w:t xml:space="preserve"> gear, go to Frusenholm and do Ice Sculpting for the </w:t>
       </w:r>
       <w:r>
         <w:rPr>
@@ -5340,7 +5370,7 @@
           <w:rFonts w:ascii="Calibri" w:cs="Calibri" w:eastAsia="Calibri" w:hAnsi="Calibri"/>
           <w:rtl w:val="0"/>
         </w:rPr>
-        <w:t xml:space="preserve">From here on out, keep your eyes open for the following activity chest drops which are particularly powerful compared to their basic versions:</w:t>
+        <w:t xml:space="preserve">From here on out, keep your eyes open for the following activity chest drops which can be upgraded (make sure you use Fine materials when upgrading!) and are particularly powerful compared to their basic versions:</w:t>
       </w:r>
     </w:p>
     <w:p>
@@ -5481,6 +5511,27 @@
           <w:rtl w:val="0"/>
         </w:rPr>
         <w:t xml:space="preserve">Big Basket + Log Basket</w:t>
+      </w:r>
+    </w:p>
+    <w:p>
+      <w:pPr>
+        <w:numPr>
+          <w:ilvl w:val="1"/>
+          <w:numId w:val="11"/>
+        </w:numPr>
+        <w:spacing w:line="259" w:lineRule="auto"/>
+        <w:ind w:left="1440" w:hanging="360"/>
+        <w:rPr>
+          <w:rFonts w:ascii="Calibri" w:cs="Calibri" w:eastAsia="Calibri" w:hAnsi="Calibri"/>
+          <w:u w:val="none"/>
+        </w:rPr>
+      </w:pPr>
+      <w:r>
+        <w:rPr>
+          <w:rFonts w:ascii="Calibri" w:cs="Calibri" w:eastAsia="Calibri" w:hAnsi="Calibri"/>
+          <w:rtl w:val="0"/>
+        </w:rPr>
+        <w:t xml:space="preserve">Sturdy Fishing Rod Rest</w:t>
       </w:r>
     </w:p>
     <w:p>
@@ -5886,19 +5937,6 @@
         <w:spacing w:after="160" w:line="259" w:lineRule="auto"/>
         <w:rPr>
           <w:rFonts w:ascii="Calibri" w:cs="Calibri" w:eastAsia="Calibri" w:hAnsi="Calibri"/>
-        </w:rPr>
-      </w:pPr>
-      <w:r>
-        <w:rPr>
-          <w:rtl w:val="0"/>
-        </w:rPr>
-      </w:r>
-    </w:p>
-    <w:p>
-      <w:pPr>
-        <w:spacing w:after="160" w:line="259" w:lineRule="auto"/>
-        <w:rPr>
-          <w:rFonts w:ascii="Calibri" w:cs="Calibri" w:eastAsia="Calibri" w:hAnsi="Calibri"/>
           <w:b w:val="1"/>
           <w:bCs w:val="1"/>
         </w:rPr>
@@ -7433,7 +7471,74 @@
           <w:rFonts w:ascii="Calibri" w:cs="Calibri" w:eastAsia="Calibri" w:hAnsi="Calibri"/>
           <w:rtl w:val="0"/>
         </w:rPr>
-        <w:t xml:space="preserve">Now that the Halfling area is unlocked, if you have 3 light sources already do Halfling jobs to at least level 2 for access to the bank in Halfmaw Hideout.</w:t>
+        <w:t xml:space="preserve">Now that the Halfling area is unlocked, if you have 3 light sources already, do Halfling jobs to at least level 2 for access to the bank in Halfmaw Hideout.</w:t>
+      </w:r>
+    </w:p>
+    <w:p>
+      <w:pPr>
+        <w:numPr>
+          <w:ilvl w:val="0"/>
+          <w:numId w:val="21"/>
+        </w:numPr>
+        <w:spacing w:line="259" w:lineRule="auto"/>
+        <w:ind w:left="720" w:hanging="360"/>
+        <w:rPr>
+          <w:rFonts w:ascii="Calibri" w:cs="Calibri" w:eastAsia="Calibri" w:hAnsi="Calibri"/>
+          <w:u w:val="none"/>
+        </w:rPr>
+      </w:pPr>
+      <w:r>
+        <w:rPr>
+          <w:rFonts w:ascii="Calibri" w:cs="Calibri" w:eastAsia="Calibri" w:hAnsi="Calibri"/>
+          <w:rtl w:val="0"/>
+        </w:rPr>
+        <w:t xml:space="preserve">Equip your best </w:t>
+      </w:r>
+      <w:r>
+        <w:rPr>
+          <w:rFonts w:ascii="Calibri" w:cs="Calibri" w:eastAsia="Calibri" w:hAnsi="Calibri"/>
+          <w:b w:val="1"/>
+          <w:bCs w:val="1"/>
+          <w:rtl w:val="0"/>
+        </w:rPr>
+        <w:t xml:space="preserve">Efficiency Agility</w:t>
+      </w:r>
+      <w:r>
+        <w:rPr>
+          <w:rFonts w:ascii="Calibri" w:cs="Calibri" w:eastAsia="Calibri" w:hAnsi="Calibri"/>
+          <w:rtl w:val="0"/>
+        </w:rPr>
+        <w:t xml:space="preserve"> gear and your Golden Skydisc and go East and East to Bilgemont Port</w:t>
+      </w:r>
+    </w:p>
+    <w:p>
+      <w:pPr>
+        <w:numPr>
+          <w:ilvl w:val="0"/>
+          <w:numId w:val="21"/>
+        </w:numPr>
+        <w:spacing w:line="259" w:lineRule="auto"/>
+        <w:ind w:left="720" w:hanging="360"/>
+        <w:rPr>
+          <w:rFonts w:ascii="Calibri" w:cs="Calibri" w:eastAsia="Calibri" w:hAnsi="Calibri"/>
+          <w:u w:val="none"/>
+        </w:rPr>
+      </w:pPr>
+      <w:r>
+        <w:rPr>
+          <w:rFonts w:ascii="Calibri" w:cs="Calibri" w:eastAsia="Calibri" w:hAnsi="Calibri"/>
+          <w:rtl w:val="0"/>
+        </w:rPr>
+        <w:t xml:space="preserve">Do the GDTE Skydisc Course 25 times and for the </w:t>
+      </w:r>
+      <w:r>
+        <w:rPr>
+          <w:rFonts w:ascii="Calibri" w:cs="Calibri" w:eastAsia="Calibri" w:hAnsi="Calibri"/>
+          <w:b w:val="1"/>
+          <w:bCs w:val="1"/>
+          <w:rtl w:val="0"/>
+        </w:rPr>
+        <w:t xml:space="preserve">!!Red Skydisc</w:t>
       </w:r>
     </w:p>
     <w:p>
@@ -7685,62 +7790,6 @@
         <w:spacing w:line="259" w:lineRule="auto"/>
         <w:ind w:left="720" w:hanging="360"/>
         <w:rPr>
-          <w:rFonts w:ascii="Calibri" w:cs="Calibri" w:eastAsia="Calibri" w:hAnsi="Calibri"/>
-        </w:rPr>
-      </w:pPr>
-      <w:r>
-        <w:rPr>
-          <w:rFonts w:ascii="Calibri" w:cs="Calibri" w:eastAsia="Calibri" w:hAnsi="Calibri"/>
-          <w:rtl w:val="0"/>
-        </w:rPr>
-        <w:t xml:space="preserve">Bank everything in Salsfirth and get your best </w:t>
-      </w:r>
-      <w:r>
-        <w:rPr>
-          <w:rFonts w:ascii="Calibri" w:cs="Calibri" w:eastAsia="Calibri" w:hAnsi="Calibri"/>
-          <w:b w:val="1"/>
-          <w:bCs w:val="1"/>
-          <w:rtl w:val="0"/>
-        </w:rPr>
-        <w:t xml:space="preserve">No Materials/Double Rewards Smithing </w:t>
-      </w:r>
-      <w:r>
-        <w:rPr>
-          <w:rFonts w:ascii="Calibri" w:cs="Calibri" w:eastAsia="Calibri" w:hAnsi="Calibri"/>
-          <w:rtl w:val="0"/>
-        </w:rPr>
-        <w:t xml:space="preserve">gear as well as enough bars to make 20 sets of level 20+ arrows and 10 sets of level 30+ arrows. Iron (20) uses Spruce Logs, Steel (30) uses Maple Logs, and Tarsillium (40) uses Mangrove Logs.</w:t>
-      </w:r>
-    </w:p>
-    <w:p>
-      <w:pPr>
-        <w:numPr>
-          <w:ilvl w:val="0"/>
-          <w:numId w:val="21"/>
-        </w:numPr>
-        <w:spacing w:line="259" w:lineRule="auto"/>
-        <w:ind w:left="720" w:hanging="360"/>
-        <w:rPr>
-          <w:rFonts w:ascii="Calibri" w:cs="Calibri" w:eastAsia="Calibri" w:hAnsi="Calibri"/>
-        </w:rPr>
-      </w:pPr>
-      <w:r>
-        <w:rPr>
-          <w:rFonts w:ascii="Calibri" w:cs="Calibri" w:eastAsia="Calibri" w:hAnsi="Calibri"/>
-          <w:rtl w:val="0"/>
-        </w:rPr>
-        <w:t xml:space="preserve">Go to Granfiddich to smith your bars.</w:t>
-      </w:r>
-    </w:p>
-    <w:p>
-      <w:pPr>
-        <w:numPr>
-          <w:ilvl w:val="0"/>
-          <w:numId w:val="21"/>
-        </w:numPr>
-        <w:spacing w:line="259" w:lineRule="auto"/>
-        <w:ind w:left="720" w:hanging="360"/>
-        <w:rPr>
           <w:rFonts w:ascii="Noto Sans Symbols" w:cs="Noto Sans Symbols" w:eastAsia="Noto Sans Symbols" w:hAnsi="Noto Sans Symbols"/>
         </w:rPr>
       </w:pPr>
@@ -8440,7 +8489,37 @@
           <w:rFonts w:ascii="Calibri" w:cs="Calibri" w:eastAsia="Calibri" w:hAnsi="Calibri"/>
           <w:rtl w:val="0"/>
         </w:rPr>
-        <w:t xml:space="preserve"> gear and 3 light sources, go to the Witched Woods and cut 250 Bamboo Logs.</w:t>
+        <w:t xml:space="preserve"> gear and 3 light sources, go to the Witched Woods and cut Bamboo Logs for a </w:t>
+      </w:r>
+      <w:r>
+        <w:rPr>
+          <w:rFonts w:ascii="Calibri" w:cs="Calibri" w:eastAsia="Calibri" w:hAnsi="Calibri"/>
+          <w:b w:val="1"/>
+          <w:bCs w:val="1"/>
+          <w:rtl w:val="0"/>
+        </w:rPr>
+        <w:t xml:space="preserve">!!Mummy Egg</w:t>
+      </w:r>
+      <w:r>
+        <w:rPr>
+          <w:rFonts w:ascii="Calibri" w:cs="Calibri" w:eastAsia="Calibri" w:hAnsi="Calibri"/>
+          <w:rtl w:val="0"/>
+        </w:rPr>
+        <w:t xml:space="preserve"> and at least 250 Bamboo Logs. Start hatching your Mummy Egg immediately. </w:t>
+      </w:r>
+      <w:r>
+        <w:rPr>
+          <w:rFonts w:ascii="Calibri" w:cs="Calibri" w:eastAsia="Calibri" w:hAnsi="Calibri"/>
+          <w:b w:val="1"/>
+          <w:bCs w:val="1"/>
+          <w:rtl w:val="0"/>
+        </w:rPr>
+        <w:t xml:space="preserve">[Normal Achievement 14]</w:t>
+      </w:r>
+      <w:r>
+        <w:rPr>
+          <w:rtl w:val="0"/>
+        </w:rPr>
       </w:r>
     </w:p>
     <w:p>
@@ -8460,6 +8539,118 @@
           <w:rFonts w:ascii="Calibri" w:cs="Calibri" w:eastAsia="Calibri" w:hAnsi="Calibri"/>
           <w:rtl w:val="0"/>
         </w:rPr>
+        <w:t xml:space="preserve">Bank everything in Salsfirth and get your best </w:t>
+      </w:r>
+      <w:r>
+        <w:rPr>
+          <w:rFonts w:ascii="Calibri" w:cs="Calibri" w:eastAsia="Calibri" w:hAnsi="Calibri"/>
+          <w:b w:val="1"/>
+          <w:bCs w:val="1"/>
+          <w:rtl w:val="0"/>
+        </w:rPr>
+        <w:t xml:space="preserve">No Materials/Double Rewards Smithing </w:t>
+      </w:r>
+      <w:r>
+        <w:rPr>
+          <w:rFonts w:ascii="Calibri" w:cs="Calibri" w:eastAsia="Calibri" w:hAnsi="Calibri"/>
+          <w:rtl w:val="0"/>
+        </w:rPr>
+        <w:t xml:space="preserve">gear as well as enough bars to make 20 sets of level 20+ arrows and 20 sets of level 30+ arrows. Iron (20) uses Spruce Logs, Steel (30) uses Maple Logs, and Tarsillium (40) uses Mangrove Logs.</w:t>
+      </w:r>
+    </w:p>
+    <w:p>
+      <w:pPr>
+        <w:numPr>
+          <w:ilvl w:val="0"/>
+          <w:numId w:val="2"/>
+        </w:numPr>
+        <w:spacing w:line="259" w:lineRule="auto"/>
+        <w:ind w:left="720" w:hanging="360"/>
+        <w:rPr>
+          <w:rFonts w:ascii="Calibri" w:cs="Calibri" w:eastAsia="Calibri" w:hAnsi="Calibri"/>
+        </w:rPr>
+      </w:pPr>
+      <w:r>
+        <w:rPr>
+          <w:rFonts w:ascii="Calibri" w:cs="Calibri" w:eastAsia="Calibri" w:hAnsi="Calibri"/>
+          <w:rtl w:val="0"/>
+        </w:rPr>
+        <w:t xml:space="preserve">Go to Granfiddich to smith your bars.</w:t>
+      </w:r>
+    </w:p>
+    <w:p>
+      <w:pPr>
+        <w:numPr>
+          <w:ilvl w:val="0"/>
+          <w:numId w:val="2"/>
+        </w:numPr>
+        <w:spacing w:line="259" w:lineRule="auto"/>
+        <w:ind w:left="720" w:hanging="360"/>
+        <w:rPr>
+          <w:rFonts w:ascii="Calibri" w:cs="Calibri" w:eastAsia="Calibri" w:hAnsi="Calibri"/>
+        </w:rPr>
+      </w:pPr>
+      <w:r>
+        <w:rPr>
+          <w:rFonts w:ascii="Calibri" w:cs="Calibri" w:eastAsia="Calibri" w:hAnsi="Calibri"/>
+          <w:rtl w:val="0"/>
+        </w:rPr>
+        <w:t xml:space="preserve">Go to Salsfirth and take out your </w:t>
+      </w:r>
+      <w:r>
+        <w:rPr>
+          <w:rFonts w:ascii="Calibri" w:cs="Calibri" w:eastAsia="Calibri" w:hAnsi="Calibri"/>
+          <w:b w:val="1"/>
+          <w:bCs w:val="1"/>
+          <w:rtl w:val="0"/>
+        </w:rPr>
+        <w:t xml:space="preserve">No Materials/Double Rewards Carpentry</w:t>
+      </w:r>
+      <w:r>
+        <w:rPr>
+          <w:rFonts w:ascii="Calibri" w:cs="Calibri" w:eastAsia="Calibri" w:hAnsi="Calibri"/>
+          <w:rtl w:val="0"/>
+        </w:rPr>
+        <w:t xml:space="preserve"> gear and the bars you just made as well as their associated logs and feathers.</w:t>
+      </w:r>
+    </w:p>
+    <w:p>
+      <w:pPr>
+        <w:numPr>
+          <w:ilvl w:val="0"/>
+          <w:numId w:val="2"/>
+        </w:numPr>
+        <w:spacing w:line="259" w:lineRule="auto"/>
+        <w:ind w:left="720" w:hanging="360"/>
+        <w:rPr>
+          <w:rFonts w:ascii="Calibri" w:cs="Calibri" w:eastAsia="Calibri" w:hAnsi="Calibri"/>
+        </w:rPr>
+      </w:pPr>
+      <w:r>
+        <w:rPr>
+          <w:rFonts w:ascii="Calibri" w:cs="Calibri" w:eastAsia="Calibri" w:hAnsi="Calibri"/>
+          <w:rtl w:val="0"/>
+        </w:rPr>
+        <w:t xml:space="preserve">Go to Halfling Campgrounds and make 20 sets of level 20+ arrows and 20 sets of level 30+ arrows</w:t>
+      </w:r>
+    </w:p>
+    <w:p>
+      <w:pPr>
+        <w:numPr>
+          <w:ilvl w:val="0"/>
+          <w:numId w:val="2"/>
+        </w:numPr>
+        <w:spacing w:line="259" w:lineRule="auto"/>
+        <w:ind w:left="720" w:hanging="360"/>
+        <w:rPr>
+          <w:rFonts w:ascii="Calibri" w:cs="Calibri" w:eastAsia="Calibri" w:hAnsi="Calibri"/>
+        </w:rPr>
+      </w:pPr>
+      <w:r>
+        <w:rPr>
+          <w:rFonts w:ascii="Calibri" w:cs="Calibri" w:eastAsia="Calibri" w:hAnsi="Calibri"/>
+          <w:rtl w:val="0"/>
+        </w:rPr>
         <w:t xml:space="preserve">Go to the Halfmaw Hideout and equip your best </w:t>
       </w:r>
       <w:r>
@@ -8492,7 +8683,7 @@
           <w:rFonts w:ascii="Calibri" w:cs="Calibri" w:eastAsia="Calibri" w:hAnsi="Calibri"/>
           <w:rtl w:val="0"/>
         </w:rPr>
-        <w:t xml:space="preserve"> gear, 3 light sources, and a stack of Simple Bowstrings</w:t>
+        <w:t xml:space="preserve"> gear, 3 light sources, 250 Bamboo Logs and a stack of Simple Bowstrings</w:t>
       </w:r>
     </w:p>
     <w:p>
@@ -8512,7 +8703,7 @@
           <w:rFonts w:ascii="Calibri" w:cs="Calibri" w:eastAsia="Calibri" w:hAnsi="Calibri"/>
           <w:rtl w:val="0"/>
         </w:rPr>
-        <w:t xml:space="preserve">Go Southeast to the Halfling Campgrounds and try to make a Great (Blue) quality Bamboo Hunting Bow. Turn your Bamboo Logs into Planks to make a Great (Blue) quality Bamboo Toolbox.</w:t>
+        <w:t xml:space="preserve">Go Southeast to the Halfling Campgrounds and make a Great (Blue) quality Bamboo Hunting Bow. Then turn your Bamboo Logs into Planks to make a Great (Blue) quality Bamboo Toolbox.</w:t>
       </w:r>
     </w:p>
     <w:p>
@@ -8860,23 +9051,23 @@
           <w:rFonts w:ascii="Calibri" w:cs="Calibri" w:eastAsia="Calibri" w:hAnsi="Calibri"/>
           <w:rtl w:val="0"/>
         </w:rPr>
-        <w:t xml:space="preserve">Take out your </w:t>
-      </w:r>
-      <w:r>
-        <w:rPr>
-          <w:rFonts w:ascii="Calibri" w:cs="Calibri" w:eastAsia="Calibri" w:hAnsi="Calibri"/>
-          <w:b w:val="1"/>
-          <w:bCs w:val="1"/>
-          <w:rtl w:val="0"/>
-        </w:rPr>
-        <w:t xml:space="preserve">No Materials/Double Rewards Carpentry</w:t>
-      </w:r>
-      <w:r>
-        <w:rPr>
-          <w:rFonts w:ascii="Calibri" w:cs="Calibri" w:eastAsia="Calibri" w:hAnsi="Calibri"/>
-          <w:rtl w:val="0"/>
-        </w:rPr>
-        <w:t xml:space="preserve"> gear and the bars you made for your level 20+ and 30+ arrows, as well as their associated logs and feathers.</w:t>
+        <w:t xml:space="preserve">Using your best </w:t>
+      </w:r>
+      <w:r>
+        <w:rPr>
+          <w:rFonts w:ascii="Calibri" w:cs="Calibri" w:eastAsia="Calibri" w:hAnsi="Calibri"/>
+          <w:b w:val="1"/>
+          <w:bCs w:val="1"/>
+          <w:rtl w:val="0"/>
+        </w:rPr>
+        <w:t xml:space="preserve">No Materials/Double Rewards Tailoring</w:t>
+      </w:r>
+      <w:r>
+        <w:rPr>
+          <w:rFonts w:ascii="Calibri" w:cs="Calibri" w:eastAsia="Calibri" w:hAnsi="Calibri"/>
+          <w:rtl w:val="0"/>
+        </w:rPr>
+        <w:t xml:space="preserve"> turn the rest of your Bamboo Logs into Linen Cloth.</w:t>
       </w:r>
     </w:p>
     <w:p>
@@ -8889,14 +9080,31 @@
         <w:ind w:left="720" w:hanging="360"/>
         <w:rPr>
           <w:rFonts w:ascii="Calibri" w:cs="Calibri" w:eastAsia="Calibri" w:hAnsi="Calibri"/>
-        </w:rPr>
-      </w:pPr>
-      <w:r>
-        <w:rPr>
-          <w:rFonts w:ascii="Calibri" w:cs="Calibri" w:eastAsia="Calibri" w:hAnsi="Calibri"/>
-          <w:rtl w:val="0"/>
-        </w:rPr>
-        <w:t xml:space="preserve">Go to Halfling Campgrounds and make 20 sets of level 20+ arrows (100 total) and 10 sets of level 30+ arrows (50 total).</w:t>
+          <w:u w:val="none"/>
+        </w:rPr>
+      </w:pPr>
+      <w:r>
+        <w:rPr>
+          <w:rFonts w:ascii="Calibri" w:cs="Calibri" w:eastAsia="Calibri" w:hAnsi="Calibri"/>
+          <w:rtl w:val="0"/>
+        </w:rPr>
+        <w:t xml:space="preserve">If you haven’t done so and have leftover Leather/Spruce Planks, try to create a Great (Blue) quality Comfy Fishing Chair using your best </w:t>
+      </w:r>
+      <w:r>
+        <w:rPr>
+          <w:rFonts w:ascii="Calibri" w:cs="Calibri" w:eastAsia="Calibri" w:hAnsi="Calibri"/>
+          <w:b w:val="1"/>
+          <w:bCs w:val="1"/>
+          <w:rtl w:val="0"/>
+        </w:rPr>
+        <w:t xml:space="preserve">Quality Outcome Carpentry</w:t>
+      </w:r>
+      <w:r>
+        <w:rPr>
+          <w:rFonts w:ascii="Calibri" w:cs="Calibri" w:eastAsia="Calibri" w:hAnsi="Calibri"/>
+          <w:rtl w:val="0"/>
+        </w:rPr>
+        <w:t xml:space="preserve"> gear at the Halfling Campgrounds</w:t>
       </w:r>
     </w:p>
     <w:p>
@@ -8916,7 +9124,7 @@
           <w:rFonts w:ascii="Calibri" w:cs="Calibri" w:eastAsia="Calibri" w:hAnsi="Calibri"/>
           <w:rtl w:val="0"/>
         </w:rPr>
-        <w:t xml:space="preserve">Go to Halfmaw Hideout and get your best </w:t>
+        <w:t xml:space="preserve">Go to Halfmaw Hideout, get your best </w:t>
       </w:r>
       <w:r>
         <w:rPr>
@@ -8932,7 +9140,7 @@
           <w:rFonts w:ascii="Calibri" w:cs="Calibri" w:eastAsia="Calibri" w:hAnsi="Calibri"/>
           <w:rtl w:val="0"/>
         </w:rPr>
-        <w:t xml:space="preserve">gear, your bow, 50 level 30+ arrows and two light sources.</w:t>
+        <w:t xml:space="preserve">gear, your bow, level 30+ arrows and two light sources.</w:t>
       </w:r>
     </w:p>
     <w:p>
@@ -8952,7 +9160,7 @@
           <w:rFonts w:ascii="Calibri" w:cs="Calibri" w:eastAsia="Calibri" w:hAnsi="Calibri"/>
           <w:rtl w:val="0"/>
         </w:rPr>
-        <w:t xml:space="preserve">Go Northwest to Bog Top and do Alligator Hunting 50 times</w:t>
+        <w:t xml:space="preserve">Go Northwest to Bog Top and do Alligator Hunting at least 50 times and until you have enough Elderhide/Scraps to make 60 Elderhide Leather</w:t>
       </w:r>
     </w:p>
     <w:p>
@@ -9044,9 +9252,9 @@
           <w:rFonts w:ascii="Calibri" w:cs="Calibri" w:eastAsia="Calibri" w:hAnsi="Calibri"/>
           <w:rtl w:val="0"/>
         </w:rPr>
-        <w:t xml:space="preserve">Achievements: 17/17 | 13/36 | 1/20 | 0/1</w:t>
+        <w:t xml:space="preserve">Achievements: 17/17 | 14/36 | 1/20 | 0/1</w:t>
         <w:br w:type="textWrapping"/>
-        <w:t xml:space="preserve">  Collectibles: 11/47 | Total Achievement Points: 73</w:t>
+        <w:t xml:space="preserve">  Collectibles: 11/47 | Total Achievement Points: 76</w:t>
         <w:br w:type="textWrapping"/>
         <w:t xml:space="preserve">  Agility: 57</w:t>
         <w:br w:type="textWrapping"/>
@@ -9215,7 +9423,7 @@
           <w:rFonts w:ascii="Calibri" w:cs="Calibri" w:eastAsia="Calibri" w:hAnsi="Calibri"/>
           <w:rtl w:val="0"/>
         </w:rPr>
-        <w:t xml:space="preserve">gear and return to Blackspell Port. You can also bring along any Linen Cloth you have if you want an extra XP boost, but save at least 150 or so in the bank if you have that many.</w:t>
+        <w:t xml:space="preserve">gear and return to Blackspell Port. You can also bring along any Linen Cloth you have if you want an extra XP boost, but save at least 350 or so in the bank if you have that many.</w:t>
       </w:r>
     </w:p>
     <w:p>
@@ -9652,7 +9860,7 @@
           <w:bCs w:val="1"/>
           <w:rtl w:val="0"/>
         </w:rPr>
-        <w:t xml:space="preserve">[Normal Achievement 14], [Hard Achievement 3]</w:t>
+        <w:t xml:space="preserve">[Normal Achievement 15], [Hard Achievement 3]</w:t>
       </w:r>
       <w:r>
         <w:rPr>
@@ -10236,9 +10444,9 @@
           <w:rFonts w:ascii="Calibri" w:cs="Calibri" w:eastAsia="Calibri" w:hAnsi="Calibri"/>
           <w:rtl w:val="0"/>
         </w:rPr>
-        <w:t xml:space="preserve">Achievements: 17/17 | 14/36 | 3/20 | 0/1</w:t>
+        <w:t xml:space="preserve">Achievements: 17/17 | 15/36 | 3/20 | 0/1</w:t>
         <w:br w:type="textWrapping"/>
-        <w:t xml:space="preserve">  Collectibles: 12/47 | Total Achievement Points: 86</w:t>
+        <w:t xml:space="preserve">  Collectibles: 12/47 | Total Achievement Points: 89</w:t>
         <w:br w:type="textWrapping"/>
         <w:t xml:space="preserve">  Agility: 57</w:t>
         <w:br w:type="textWrapping"/>
@@ -10322,7 +10530,7 @@
           <w:bCs w:val="1"/>
           <w:rtl w:val="0"/>
         </w:rPr>
-        <w:t xml:space="preserve">[Normal Achievement 15]</w:t>
+        <w:t xml:space="preserve">[Normal Achievement 16]</w:t>
       </w:r>
       <w:r>
         <w:rPr>
@@ -10330,6 +10538,80 @@
           <w:rtl w:val="0"/>
         </w:rPr>
         <w:t xml:space="preserve">. Then craft a Spectral Saw and Repair the Bank.</w:t>
+      </w:r>
+    </w:p>
+    <w:p>
+      <w:pPr>
+        <w:numPr>
+          <w:ilvl w:val="0"/>
+          <w:numId w:val="2"/>
+        </w:numPr>
+        <w:spacing w:line="259" w:lineRule="auto"/>
+        <w:ind w:left="720" w:hanging="360"/>
+        <w:rPr>
+          <w:rFonts w:ascii="Calibri" w:cs="Calibri" w:eastAsia="Calibri" w:hAnsi="Calibri"/>
+          <w:u w:val="none"/>
+        </w:rPr>
+      </w:pPr>
+      <w:r>
+        <w:rPr>
+          <w:rFonts w:ascii="Calibri" w:cs="Calibri" w:eastAsia="Calibri" w:hAnsi="Calibri"/>
+          <w:rtl w:val="0"/>
+        </w:rPr>
+        <w:t xml:space="preserve">Using your best </w:t>
+      </w:r>
+      <w:r>
+        <w:rPr>
+          <w:rFonts w:ascii="Calibri" w:cs="Calibri" w:eastAsia="Calibri" w:hAnsi="Calibri"/>
+          <w:b w:val="1"/>
+          <w:bCs w:val="1"/>
+          <w:rtl w:val="0"/>
+        </w:rPr>
+        <w:t xml:space="preserve">No Materials/Double Rewards Tailoring</w:t>
+      </w:r>
+      <w:r>
+        <w:rPr>
+          <w:rFonts w:ascii="Calibri" w:cs="Calibri" w:eastAsia="Calibri" w:hAnsi="Calibri"/>
+          <w:rtl w:val="0"/>
+        </w:rPr>
+        <w:t xml:space="preserve"> gear turn all of your Elderhide and Elderhide Scraps into Elderhide Leather</w:t>
+      </w:r>
+    </w:p>
+    <w:p>
+      <w:pPr>
+        <w:numPr>
+          <w:ilvl w:val="0"/>
+          <w:numId w:val="2"/>
+        </w:numPr>
+        <w:spacing w:line="259" w:lineRule="auto"/>
+        <w:ind w:left="720" w:hanging="360"/>
+        <w:rPr>
+          <w:rFonts w:ascii="Calibri" w:cs="Calibri" w:eastAsia="Calibri" w:hAnsi="Calibri"/>
+          <w:u w:val="none"/>
+        </w:rPr>
+      </w:pPr>
+      <w:r>
+        <w:rPr>
+          <w:rFonts w:ascii="Calibri" w:cs="Calibri" w:eastAsia="Calibri" w:hAnsi="Calibri"/>
+          <w:rtl w:val="0"/>
+        </w:rPr>
+        <w:t xml:space="preserve">Using your best </w:t>
+      </w:r>
+      <w:r>
+        <w:rPr>
+          <w:rFonts w:ascii="Calibri" w:cs="Calibri" w:eastAsia="Calibri" w:hAnsi="Calibri"/>
+          <w:b w:val="1"/>
+          <w:bCs w:val="1"/>
+          <w:rtl w:val="0"/>
+        </w:rPr>
+        <w:t xml:space="preserve">Quality Outcome Tailoring</w:t>
+      </w:r>
+      <w:r>
+        <w:rPr>
+          <w:rFonts w:ascii="Calibri" w:cs="Calibri" w:eastAsia="Calibri" w:hAnsi="Calibri"/>
+          <w:rtl w:val="0"/>
+        </w:rPr>
+        <w:t xml:space="preserve"> gear, make a Great (Blue) quality set of Elderhide. Prioritize gloves, then chest and finally legs.</w:t>
       </w:r>
     </w:p>
     <w:p>
@@ -10638,7 +10920,7 @@
           <w:bCs w:val="1"/>
           <w:rtl w:val="0"/>
         </w:rPr>
-        <w:t xml:space="preserve">[Normal Achievement 16]</w:t>
+        <w:t xml:space="preserve">[Normal Achievement 17]</w:t>
       </w:r>
       <w:r>
         <w:rPr>
@@ -10708,7 +10990,7 @@
           <w:bCs w:val="1"/>
           <w:rtl w:val="0"/>
         </w:rPr>
-        <w:t xml:space="preserve">[Normal Achievement 17] </w:t>
+        <w:t xml:space="preserve">[Normal Achievement 18] </w:t>
       </w:r>
       <w:r>
         <w:rPr>
@@ -10735,16 +11017,16 @@
           <w:rFonts w:ascii="Calibri" w:cs="Calibri" w:eastAsia="Calibri" w:hAnsi="Calibri"/>
           <w:rtl w:val="0"/>
         </w:rPr>
-        <w:t xml:space="preserve">You should also by now have long since opened 100 chests and traveled 100,000 steps </w:t>
-      </w:r>
-      <w:r>
-        <w:rPr>
-          <w:rFonts w:ascii="Calibri" w:cs="Calibri" w:eastAsia="Calibri" w:hAnsi="Calibri"/>
-          <w:b w:val="1"/>
-          <w:bCs w:val="1"/>
-          <w:rtl w:val="0"/>
-        </w:rPr>
-        <w:t xml:space="preserve">[Normal Achievements 18, 19]</w:t>
+        <w:t xml:space="preserve">You should have opened 100 chests and traveled 100,000 steps </w:t>
+      </w:r>
+      <w:r>
+        <w:rPr>
+          <w:rFonts w:ascii="Calibri" w:cs="Calibri" w:eastAsia="Calibri" w:hAnsi="Calibri"/>
+          <w:b w:val="1"/>
+          <w:bCs w:val="1"/>
+          <w:rtl w:val="0"/>
+        </w:rPr>
+        <w:t xml:space="preserve">[Normal Achievements 19, 20]</w:t>
       </w:r>
       <w:r>
         <w:rPr>
@@ -10778,7 +11060,7 @@
           <w:bCs w:val="1"/>
           <w:rtl w:val="0"/>
         </w:rPr>
-        <w:t xml:space="preserve">[Normal Achievement 20]</w:t>
+        <w:t xml:space="preserve">[Normal Achievement 21]</w:t>
       </w:r>
       <w:r>
         <w:rPr>
@@ -10845,20 +11127,6 @@
           <w:rtl w:val="0"/>
         </w:rPr>
         <w:t xml:space="preserve">Homesickness Ring to Kallaheim and bank everything</w:t>
-      </w:r>
-    </w:p>
-    <w:p>
-      <w:pPr>
-        <w:spacing w:line="259" w:lineRule="auto"/>
-        <w:ind w:left="720" w:firstLine="0"/>
-        <w:rPr>
-          <w:rFonts w:ascii="Calibri" w:cs="Calibri" w:eastAsia="Calibri" w:hAnsi="Calibri"/>
-        </w:rPr>
-      </w:pPr>
-      <w:r>
-        <w:rPr>
-          <w:rtl w:val="0"/>
-        </w:rPr>
       </w:r>
     </w:p>
     <w:p>
@@ -10903,9 +11171,9 @@
           <w:rFonts w:ascii="Calibri" w:cs="Calibri" w:eastAsia="Calibri" w:hAnsi="Calibri"/>
           <w:rtl w:val="0"/>
         </w:rPr>
-        <w:t xml:space="preserve">Achievements: 17/17 | 20/36 | 3/20 | 0/1</w:t>
+        <w:t xml:space="preserve">Achievements: 17/17 | 21/36 | 3/20 | 0/1</w:t>
         <w:br w:type="textWrapping"/>
-        <w:t xml:space="preserve">  Collectibles: 14/47 | Total Achievement Points: 106</w:t>
+        <w:t xml:space="preserve">  Collectibles: 14/47 | Total Achievement Points: 109</w:t>
         <w:br w:type="textWrapping"/>
         <w:t xml:space="preserve">  Agility: 57</w:t>
         <w:br w:type="textWrapping"/>
@@ -11138,21 +11406,185 @@
           <w:rFonts w:ascii="Calibri" w:cs="Calibri" w:eastAsia="Calibri" w:hAnsi="Calibri"/>
           <w:rtl w:val="0"/>
         </w:rPr>
-        <w:t xml:space="preserve">While in Jarvonia, equip the Reindeer Pet until it reaches Adulthood, your Camel should also hatch in this next section </w:t>
-      </w:r>
-      <w:r>
-        <w:rPr>
-          <w:rFonts w:ascii="Calibri" w:cs="Calibri" w:eastAsia="Calibri" w:hAnsi="Calibri"/>
-          <w:b w:val="1"/>
-          <w:bCs w:val="1"/>
-          <w:rtl w:val="0"/>
-        </w:rPr>
-        <w:t xml:space="preserve">[Normal Achievements 21, 22].</w:t>
-      </w:r>
-      <w:r>
-        <w:rPr>
-          <w:rtl w:val="0"/>
-        </w:rPr>
+        <w:t xml:space="preserve">While in Jarvonia, prioritize leveling the Reindeer Pet until it reaches Adulthood, you should also have hatched 5 pets by now </w:t>
+      </w:r>
+      <w:r>
+        <w:rPr>
+          <w:rFonts w:ascii="Calibri" w:cs="Calibri" w:eastAsia="Calibri" w:hAnsi="Calibri"/>
+          <w:b w:val="1"/>
+          <w:bCs w:val="1"/>
+          <w:rtl w:val="0"/>
+        </w:rPr>
+        <w:t xml:space="preserve">[Normal Achievements 22, 23].</w:t>
+      </w:r>
+      <w:r>
+        <w:rPr>
+          <w:rtl w:val="0"/>
+        </w:rPr>
+      </w:r>
+    </w:p>
+    <w:p>
+      <w:pPr>
+        <w:numPr>
+          <w:ilvl w:val="0"/>
+          <w:numId w:val="2"/>
+        </w:numPr>
+        <w:spacing w:line="259" w:lineRule="auto"/>
+        <w:ind w:left="720" w:hanging="360"/>
+        <w:rPr>
+          <w:rFonts w:ascii="Noto Sans Symbols" w:cs="Noto Sans Symbols" w:eastAsia="Noto Sans Symbols" w:hAnsi="Noto Sans Symbols"/>
+        </w:rPr>
+      </w:pPr>
+      <w:r>
+        <w:rPr>
+          <w:rFonts w:ascii="Calibri" w:cs="Calibri" w:eastAsia="Calibri" w:hAnsi="Calibri"/>
+          <w:rtl w:val="0"/>
+        </w:rPr>
+        <w:t xml:space="preserve">If you don’t have a Grappling Hook or Lily Pad, using your best </w:t>
+      </w:r>
+      <w:r>
+        <w:rPr>
+          <w:rFonts w:ascii="Calibri" w:cs="Calibri" w:eastAsia="Calibri" w:hAnsi="Calibri"/>
+          <w:b w:val="1"/>
+          <w:bCs w:val="1"/>
+          <w:rtl w:val="0"/>
+        </w:rPr>
+        <w:t xml:space="preserve">No Materials/Double Rewards Crafting</w:t>
+      </w:r>
+      <w:r>
+        <w:rPr>
+          <w:rFonts w:ascii="Calibri" w:cs="Calibri" w:eastAsia="Calibri" w:hAnsi="Calibri"/>
+          <w:rtl w:val="0"/>
+        </w:rPr>
+        <w:t xml:space="preserve"> gear Upcycle Trash until you find a and $$Simple Rope</w:t>
+      </w:r>
+    </w:p>
+    <w:p>
+      <w:pPr>
+        <w:numPr>
+          <w:ilvl w:val="0"/>
+          <w:numId w:val="2"/>
+        </w:numPr>
+        <w:spacing w:line="259" w:lineRule="auto"/>
+        <w:ind w:left="720" w:hanging="360"/>
+        <w:rPr>
+          <w:rFonts w:ascii="Calibri" w:cs="Calibri" w:eastAsia="Calibri" w:hAnsi="Calibri"/>
+        </w:rPr>
+      </w:pPr>
+      <w:r>
+        <w:rPr>
+          <w:rFonts w:ascii="Calibri" w:cs="Calibri" w:eastAsia="Calibri" w:hAnsi="Calibri"/>
+          <w:rtl w:val="0"/>
+        </w:rPr>
+        <w:t xml:space="preserve">Using your best </w:t>
+      </w:r>
+      <w:r>
+        <w:rPr>
+          <w:rFonts w:ascii="Calibri" w:cs="Calibri" w:eastAsia="Calibri" w:hAnsi="Calibri"/>
+          <w:b w:val="1"/>
+          <w:bCs w:val="1"/>
+          <w:rtl w:val="0"/>
+        </w:rPr>
+        <w:t xml:space="preserve">No Materials/Double Rewards Cooking</w:t>
+      </w:r>
+      <w:r>
+        <w:rPr>
+          <w:rFonts w:ascii="Calibri" w:cs="Calibri" w:eastAsia="Calibri" w:hAnsi="Calibri"/>
+          <w:rtl w:val="0"/>
+        </w:rPr>
+        <w:t xml:space="preserve"> gear, make 300ish Jelly Sandwiches</w:t>
+      </w:r>
+    </w:p>
+    <w:p>
+      <w:pPr>
+        <w:numPr>
+          <w:ilvl w:val="0"/>
+          <w:numId w:val="2"/>
+        </w:numPr>
+        <w:spacing w:line="259" w:lineRule="auto"/>
+        <w:ind w:left="720" w:hanging="360"/>
+        <w:rPr>
+          <w:rFonts w:ascii="Calibri" w:cs="Calibri" w:eastAsia="Calibri" w:hAnsi="Calibri"/>
+        </w:rPr>
+      </w:pPr>
+      <w:r>
+        <w:rPr>
+          <w:rFonts w:ascii="Calibri" w:cs="Calibri" w:eastAsia="Calibri" w:hAnsi="Calibri"/>
+          <w:rtl w:val="0"/>
+        </w:rPr>
+        <w:t xml:space="preserve">Equip your best </w:t>
+      </w:r>
+      <w:r>
+        <w:rPr>
+          <w:rFonts w:ascii="Calibri" w:cs="Calibri" w:eastAsia="Calibri" w:hAnsi="Calibri"/>
+          <w:b w:val="1"/>
+          <w:bCs w:val="1"/>
+          <w:rtl w:val="0"/>
+        </w:rPr>
+        <w:t xml:space="preserve">Quality Outcome Tailoring</w:t>
+      </w:r>
+      <w:r>
+        <w:rPr>
+          <w:rFonts w:ascii="Calibri" w:cs="Calibri" w:eastAsia="Calibri" w:hAnsi="Calibri"/>
+          <w:rtl w:val="0"/>
+        </w:rPr>
+        <w:t xml:space="preserve"> gear, take out 160 Linen Cloth, 60 Basic Leather, and 60 Aerodynamic Thread. Create the Linen/Leather first if you don’t have enough.</w:t>
+      </w:r>
+    </w:p>
+    <w:p>
+      <w:pPr>
+        <w:numPr>
+          <w:ilvl w:val="0"/>
+          <w:numId w:val="2"/>
+        </w:numPr>
+        <w:spacing w:line="259" w:lineRule="auto"/>
+        <w:ind w:left="720" w:hanging="360"/>
+        <w:rPr>
+          <w:rFonts w:ascii="Calibri" w:cs="Calibri" w:eastAsia="Calibri" w:hAnsi="Calibri"/>
+        </w:rPr>
+      </w:pPr>
+      <w:r>
+        <w:rPr>
+          <w:rFonts w:ascii="Calibri" w:cs="Calibri" w:eastAsia="Calibri" w:hAnsi="Calibri"/>
+          <w:rtl w:val="0"/>
+        </w:rPr>
+        <w:t xml:space="preserve">Go to Frusenholm and create a Great (Blue) quality set of Aerofibril equipment. Prioritize Hands, then Chest. You can skip the Legs if you’d like as Flowy Trousers are almost always better until you get to Perfect quality or above.</w:t>
+      </w:r>
+    </w:p>
+    <w:p>
+      <w:pPr>
+        <w:numPr>
+          <w:ilvl w:val="0"/>
+          <w:numId w:val="2"/>
+        </w:numPr>
+        <w:spacing w:line="259" w:lineRule="auto"/>
+        <w:ind w:left="720" w:hanging="360"/>
+        <w:rPr>
+          <w:rFonts w:ascii="Noto Sans Symbols" w:cs="Noto Sans Symbols" w:eastAsia="Noto Sans Symbols" w:hAnsi="Noto Sans Symbols"/>
+        </w:rPr>
+      </w:pPr>
+      <w:r>
+        <w:rPr>
+          <w:rFonts w:ascii="Calibri" w:cs="Calibri" w:eastAsia="Calibri" w:hAnsi="Calibri"/>
+          <w:rtl w:val="0"/>
+        </w:rPr>
+        <w:t xml:space="preserve">Return to Kallaheim and equip your best </w:t>
+      </w:r>
+      <w:r>
+        <w:rPr>
+          <w:rFonts w:ascii="Calibri" w:cs="Calibri" w:eastAsia="Calibri" w:hAnsi="Calibri"/>
+          <w:b w:val="1"/>
+          <w:bCs w:val="1"/>
+          <w:rtl w:val="0"/>
+        </w:rPr>
+        <w:t xml:space="preserve">Double Reward/Action/Fine Material Agility</w:t>
+      </w:r>
+      <w:r>
+        <w:rPr>
+          <w:rFonts w:ascii="Calibri" w:cs="Calibri" w:eastAsia="Calibri" w:hAnsi="Calibri"/>
+          <w:rtl w:val="0"/>
+        </w:rPr>
+        <w:t xml:space="preserve"> gear (and Skis, Climbing Gear, and Wanderlust Walking Stick if you have one) for the Rescue Team grind</w:t>
       </w:r>
     </w:p>
     <w:p>
@@ -11164,179 +11596,15 @@
         <w:spacing w:line="259" w:lineRule="auto"/>
         <w:ind w:left="1440" w:hanging="360"/>
         <w:rPr>
-          <w:rFonts w:ascii="Calibri" w:cs="Calibri" w:eastAsia="Calibri" w:hAnsi="Calibri"/>
-        </w:rPr>
-      </w:pPr>
-      <w:r>
-        <w:rPr>
-          <w:rFonts w:ascii="Calibri" w:cs="Calibri" w:eastAsia="Calibri" w:hAnsi="Calibri"/>
-          <w:rtl w:val="0"/>
-        </w:rPr>
-        <w:t xml:space="preserve">After your Reindeer reaches adulthood, equip the Chicken for any Foraging activity, and the Tortoise otherwise.</w:t>
-      </w:r>
-    </w:p>
-    <w:p>
-      <w:pPr>
-        <w:numPr>
-          <w:ilvl w:val="0"/>
-          <w:numId w:val="2"/>
-        </w:numPr>
-        <w:spacing w:line="259" w:lineRule="auto"/>
-        <w:ind w:left="720" w:hanging="360"/>
-        <w:rPr>
-          <w:rFonts w:ascii="Noto Sans Symbols" w:cs="Noto Sans Symbols" w:eastAsia="Noto Sans Symbols" w:hAnsi="Noto Sans Symbols"/>
-        </w:rPr>
-      </w:pPr>
-      <w:r>
-        <w:rPr>
-          <w:rFonts w:ascii="Calibri" w:cs="Calibri" w:eastAsia="Calibri" w:hAnsi="Calibri"/>
-          <w:rtl w:val="0"/>
-        </w:rPr>
-        <w:t xml:space="preserve">If you don’t have a Grappling Hook or Lily Pad, using your best </w:t>
-      </w:r>
-      <w:r>
-        <w:rPr>
-          <w:rFonts w:ascii="Calibri" w:cs="Calibri" w:eastAsia="Calibri" w:hAnsi="Calibri"/>
-          <w:b w:val="1"/>
-          <w:bCs w:val="1"/>
-          <w:rtl w:val="0"/>
-        </w:rPr>
-        <w:t xml:space="preserve">No Materials/Double Rewards Crafting</w:t>
-      </w:r>
-      <w:r>
-        <w:rPr>
-          <w:rFonts w:ascii="Calibri" w:cs="Calibri" w:eastAsia="Calibri" w:hAnsi="Calibri"/>
-          <w:rtl w:val="0"/>
-        </w:rPr>
-        <w:t xml:space="preserve"> gear Upcycle Trash until you find a and $$Simple Rope</w:t>
-      </w:r>
-    </w:p>
-    <w:p>
-      <w:pPr>
-        <w:numPr>
-          <w:ilvl w:val="0"/>
-          <w:numId w:val="2"/>
-        </w:numPr>
-        <w:spacing w:line="259" w:lineRule="auto"/>
-        <w:ind w:left="720" w:hanging="360"/>
-        <w:rPr>
-          <w:rFonts w:ascii="Calibri" w:cs="Calibri" w:eastAsia="Calibri" w:hAnsi="Calibri"/>
-        </w:rPr>
-      </w:pPr>
-      <w:r>
-        <w:rPr>
-          <w:rFonts w:ascii="Calibri" w:cs="Calibri" w:eastAsia="Calibri" w:hAnsi="Calibri"/>
-          <w:rtl w:val="0"/>
-        </w:rPr>
-        <w:t xml:space="preserve">Using your best </w:t>
-      </w:r>
-      <w:r>
-        <w:rPr>
-          <w:rFonts w:ascii="Calibri" w:cs="Calibri" w:eastAsia="Calibri" w:hAnsi="Calibri"/>
-          <w:b w:val="1"/>
-          <w:bCs w:val="1"/>
-          <w:rtl w:val="0"/>
-        </w:rPr>
-        <w:t xml:space="preserve">No Materials/Double Rewards Cooking</w:t>
-      </w:r>
-      <w:r>
-        <w:rPr>
-          <w:rFonts w:ascii="Calibri" w:cs="Calibri" w:eastAsia="Calibri" w:hAnsi="Calibri"/>
-          <w:rtl w:val="0"/>
-        </w:rPr>
-        <w:t xml:space="preserve"> gear, make 300ish Jelly Sandwiches</w:t>
-      </w:r>
-    </w:p>
-    <w:p>
-      <w:pPr>
-        <w:numPr>
-          <w:ilvl w:val="0"/>
-          <w:numId w:val="2"/>
-        </w:numPr>
-        <w:spacing w:line="259" w:lineRule="auto"/>
-        <w:ind w:left="720" w:hanging="360"/>
-        <w:rPr>
-          <w:rFonts w:ascii="Calibri" w:cs="Calibri" w:eastAsia="Calibri" w:hAnsi="Calibri"/>
-        </w:rPr>
-      </w:pPr>
-      <w:r>
-        <w:rPr>
-          <w:rFonts w:ascii="Calibri" w:cs="Calibri" w:eastAsia="Calibri" w:hAnsi="Calibri"/>
-          <w:rtl w:val="0"/>
-        </w:rPr>
-        <w:t xml:space="preserve">Equip your best </w:t>
-      </w:r>
-      <w:r>
-        <w:rPr>
-          <w:rFonts w:ascii="Calibri" w:cs="Calibri" w:eastAsia="Calibri" w:hAnsi="Calibri"/>
-          <w:b w:val="1"/>
-          <w:bCs w:val="1"/>
-          <w:rtl w:val="0"/>
-        </w:rPr>
-        <w:t xml:space="preserve">Quality Outcome Tailoring</w:t>
-      </w:r>
-      <w:r>
-        <w:rPr>
-          <w:rFonts w:ascii="Calibri" w:cs="Calibri" w:eastAsia="Calibri" w:hAnsi="Calibri"/>
-          <w:rtl w:val="0"/>
-        </w:rPr>
-        <w:t xml:space="preserve"> gear, take out 160 Linen Cloth, 60 Basic Leather, and 60 Aerodynamic Thread. Create the Linen/Leather first if you don’t have enough.</w:t>
-      </w:r>
-    </w:p>
-    <w:p>
-      <w:pPr>
-        <w:numPr>
-          <w:ilvl w:val="0"/>
-          <w:numId w:val="2"/>
-        </w:numPr>
-        <w:spacing w:line="259" w:lineRule="auto"/>
-        <w:ind w:left="720" w:hanging="360"/>
-        <w:rPr>
-          <w:rFonts w:ascii="Calibri" w:cs="Calibri" w:eastAsia="Calibri" w:hAnsi="Calibri"/>
-        </w:rPr>
-      </w:pPr>
-      <w:r>
-        <w:rPr>
-          <w:rFonts w:ascii="Calibri" w:cs="Calibri" w:eastAsia="Calibri" w:hAnsi="Calibri"/>
-          <w:rtl w:val="0"/>
-        </w:rPr>
-        <w:t xml:space="preserve">Go to Frusenholm and create a Great (Blue) quality set of Aerofibril equipment. Prioritize Hands, then Chest. You can skip the Legs if you’d like as Flowy Trousers are almost always better until you get to Perfect quality or above.</w:t>
-      </w:r>
-    </w:p>
-    <w:p>
-      <w:pPr>
-        <w:numPr>
-          <w:ilvl w:val="0"/>
-          <w:numId w:val="2"/>
-        </w:numPr>
-        <w:spacing w:line="259" w:lineRule="auto"/>
-        <w:ind w:left="720" w:hanging="360"/>
-        <w:rPr>
-          <w:rFonts w:ascii="Noto Sans Symbols" w:cs="Noto Sans Symbols" w:eastAsia="Noto Sans Symbols" w:hAnsi="Noto Sans Symbols"/>
-        </w:rPr>
-      </w:pPr>
-      <w:r>
-        <w:rPr>
-          <w:rFonts w:ascii="Calibri" w:cs="Calibri" w:eastAsia="Calibri" w:hAnsi="Calibri"/>
-          <w:rtl w:val="0"/>
-        </w:rPr>
-        <w:t xml:space="preserve">Return to Kallaheim and equip your best </w:t>
-      </w:r>
-      <w:r>
-        <w:rPr>
-          <w:rFonts w:ascii="Calibri" w:cs="Calibri" w:eastAsia="Calibri" w:hAnsi="Calibri"/>
-          <w:b w:val="1"/>
-          <w:bCs w:val="1"/>
-          <w:rtl w:val="0"/>
-        </w:rPr>
-        <w:t xml:space="preserve">Double Reward/Action/Fine Material Agility</w:t>
-      </w:r>
-      <w:r>
-        <w:rPr>
-          <w:rFonts w:ascii="Calibri" w:cs="Calibri" w:eastAsia="Calibri" w:hAnsi="Calibri"/>
-          <w:rtl w:val="0"/>
-        </w:rPr>
-        <w:t xml:space="preserve"> gear (and Skis, Climbing Gear, and Wanderlust Walking Stick if you have one) for the Rescue Team grind</w:t>
+          <w:rFonts w:ascii="Courier New" w:cs="Courier New" w:eastAsia="Courier New" w:hAnsi="Courier New"/>
+        </w:rPr>
+      </w:pPr>
+      <w:r>
+        <w:rPr>
+          <w:rFonts w:ascii="Calibri" w:cs="Calibri" w:eastAsia="Calibri" w:hAnsi="Calibri"/>
+          <w:rtl w:val="0"/>
+        </w:rPr>
+        <w:t xml:space="preserve">You only need 25% efficiency from gear to hit the cap so fill up with as much Double Action/Reward, Fine Material as you can otherwise</w:t>
       </w:r>
     </w:p>
     <w:p>
@@ -11348,15 +11616,15 @@
         <w:spacing w:line="259" w:lineRule="auto"/>
         <w:ind w:left="1440" w:hanging="360"/>
         <w:rPr>
-          <w:rFonts w:ascii="Courier New" w:cs="Courier New" w:eastAsia="Courier New" w:hAnsi="Courier New"/>
-        </w:rPr>
-      </w:pPr>
-      <w:r>
-        <w:rPr>
-          <w:rFonts w:ascii="Calibri" w:cs="Calibri" w:eastAsia="Calibri" w:hAnsi="Calibri"/>
-          <w:rtl w:val="0"/>
-        </w:rPr>
-        <w:t xml:space="preserve">You only need 25% efficiency from gear to hit the cap so fill up with as much Double Action/Reward, Fine Material as you can otherwise</w:t>
+          <w:rFonts w:ascii="Calibri" w:cs="Calibri" w:eastAsia="Calibri" w:hAnsi="Calibri"/>
+        </w:rPr>
+      </w:pPr>
+      <w:r>
+        <w:rPr>
+          <w:rFonts w:ascii="Calibri" w:cs="Calibri" w:eastAsia="Calibri" w:hAnsi="Calibri"/>
+          <w:rtl w:val="0"/>
+        </w:rPr>
+        <w:t xml:space="preserve">Pins are worth 2, Tags: 10, Remains: 20 (and Fine variants are 5x the normal amount)</w:t>
       </w:r>
     </w:p>
     <w:p>
@@ -11376,7 +11644,23 @@
           <w:rFonts w:ascii="Calibri" w:cs="Calibri" w:eastAsia="Calibri" w:hAnsi="Calibri"/>
           <w:rtl w:val="0"/>
         </w:rPr>
-        <w:t xml:space="preserve">Pins are worth 2, Tags: 10, Remains: 20 (and Fine variants are 5x the normal amount)</w:t>
+        <w:t xml:space="preserve">Double Action/Reward is </w:t>
+      </w:r>
+      <w:r>
+        <w:rPr>
+          <w:rFonts w:ascii="Calibri" w:cs="Calibri" w:eastAsia="Calibri" w:hAnsi="Calibri"/>
+          <w:b w:val="1"/>
+          <w:bCs w:val="1"/>
+          <w:rtl w:val="0"/>
+        </w:rPr>
+        <w:t xml:space="preserve">much </w:t>
+      </w:r>
+      <w:r>
+        <w:rPr>
+          <w:rFonts w:ascii="Calibri" w:cs="Calibri" w:eastAsia="Calibri" w:hAnsi="Calibri"/>
+          <w:rtl w:val="0"/>
+        </w:rPr>
+        <w:t xml:space="preserve">better than Fine Material. Let’s say normally doing 100 completions gives 99 regular drops and 1 fine drop. Increasing your Double Reward by 10% means 109 regular drops and 1 fine drop (114 tokens). Increasing your Fine Material by 100% means 98 regular drops and 2 fine drops (108 tokens). </w:t>
       </w:r>
     </w:p>
     <w:p>
@@ -11388,31 +11672,460 @@
         <w:spacing w:line="259" w:lineRule="auto"/>
         <w:ind w:left="1440" w:hanging="360"/>
         <w:rPr>
-          <w:rFonts w:ascii="Calibri" w:cs="Calibri" w:eastAsia="Calibri" w:hAnsi="Calibri"/>
-        </w:rPr>
-      </w:pPr>
-      <w:r>
-        <w:rPr>
-          <w:rFonts w:ascii="Calibri" w:cs="Calibri" w:eastAsia="Calibri" w:hAnsi="Calibri"/>
-          <w:rtl w:val="0"/>
-        </w:rPr>
-        <w:t xml:space="preserve">Double Action/Reward is </w:t>
-      </w:r>
-      <w:r>
-        <w:rPr>
-          <w:rFonts w:ascii="Calibri" w:cs="Calibri" w:eastAsia="Calibri" w:hAnsi="Calibri"/>
-          <w:b w:val="1"/>
-          <w:bCs w:val="1"/>
-          <w:rtl w:val="0"/>
-        </w:rPr>
-        <w:t xml:space="preserve">much </w:t>
-      </w:r>
-      <w:r>
-        <w:rPr>
-          <w:rFonts w:ascii="Calibri" w:cs="Calibri" w:eastAsia="Calibri" w:hAnsi="Calibri"/>
-          <w:rtl w:val="0"/>
-        </w:rPr>
-        <w:t xml:space="preserve">better than Fine Material. Let’s say normally doing 100 completions gives 99 regular drops and 1 fine drop. Increasing your Double Reward by 10% means 109 regular drops and 1 fine drop (114 tokens). Increasing your Fine Material by 100% means 98 regular drops and 2 fine drops (108 tokens). </w:t>
+          <w:rFonts w:ascii="Courier New" w:cs="Courier New" w:eastAsia="Courier New" w:hAnsi="Courier New"/>
+        </w:rPr>
+      </w:pPr>
+      <w:r>
+        <w:rPr>
+          <w:rFonts w:ascii="Calibri" w:cs="Calibri" w:eastAsia="Calibri" w:hAnsi="Calibri"/>
+          <w:rtl w:val="0"/>
+        </w:rPr>
+        <w:t xml:space="preserve">Here is an example loadout:</w:t>
+      </w:r>
+    </w:p>
+    <w:p>
+      <w:pPr>
+        <w:numPr>
+          <w:ilvl w:val="2"/>
+          <w:numId w:val="2"/>
+        </w:numPr>
+        <w:spacing w:line="259" w:lineRule="auto"/>
+        <w:ind w:left="2160" w:hanging="360"/>
+        <w:rPr>
+          <w:rFonts w:ascii="Noto Sans Symbols" w:cs="Noto Sans Symbols" w:eastAsia="Noto Sans Symbols" w:hAnsi="Noto Sans Symbols"/>
+        </w:rPr>
+      </w:pPr>
+      <w:r>
+        <w:rPr>
+          <w:rFonts w:ascii="Calibri" w:cs="Calibri" w:eastAsia="Calibri" w:hAnsi="Calibri"/>
+          <w:rtl w:val="0"/>
+        </w:rPr>
+        <w:t xml:space="preserve">Cape: Feather Cape</w:t>
+      </w:r>
+    </w:p>
+    <w:p>
+      <w:pPr>
+        <w:numPr>
+          <w:ilvl w:val="2"/>
+          <w:numId w:val="2"/>
+        </w:numPr>
+        <w:spacing w:line="259" w:lineRule="auto"/>
+        <w:ind w:left="2160" w:hanging="360"/>
+        <w:rPr>
+          <w:rFonts w:ascii="Noto Sans Symbols" w:cs="Noto Sans Symbols" w:eastAsia="Noto Sans Symbols" w:hAnsi="Noto Sans Symbols"/>
+        </w:rPr>
+      </w:pPr>
+      <w:r>
+        <w:rPr>
+          <w:rFonts w:ascii="Calibri" w:cs="Calibri" w:eastAsia="Calibri" w:hAnsi="Calibri"/>
+          <w:rtl w:val="0"/>
+        </w:rPr>
+        <w:t xml:space="preserve">Back: Grappling Hook (or Lily Pad if you have it)</w:t>
+      </w:r>
+    </w:p>
+    <w:p>
+      <w:pPr>
+        <w:numPr>
+          <w:ilvl w:val="2"/>
+          <w:numId w:val="2"/>
+        </w:numPr>
+        <w:spacing w:line="259" w:lineRule="auto"/>
+        <w:ind w:left="2160" w:hanging="360"/>
+        <w:rPr>
+          <w:rFonts w:ascii="Noto Sans Symbols" w:cs="Noto Sans Symbols" w:eastAsia="Noto Sans Symbols" w:hAnsi="Noto Sans Symbols"/>
+        </w:rPr>
+      </w:pPr>
+      <w:r>
+        <w:rPr>
+          <w:rFonts w:ascii="Calibri" w:cs="Calibri" w:eastAsia="Calibri" w:hAnsi="Calibri"/>
+          <w:rtl w:val="0"/>
+        </w:rPr>
+        <w:t xml:space="preserve">Head: Running Visor</w:t>
+      </w:r>
+    </w:p>
+    <w:p>
+      <w:pPr>
+        <w:numPr>
+          <w:ilvl w:val="2"/>
+          <w:numId w:val="2"/>
+        </w:numPr>
+        <w:spacing w:line="259" w:lineRule="auto"/>
+        <w:ind w:left="2160" w:hanging="360"/>
+        <w:rPr>
+          <w:rFonts w:ascii="Noto Sans Symbols" w:cs="Noto Sans Symbols" w:eastAsia="Noto Sans Symbols" w:hAnsi="Noto Sans Symbols"/>
+        </w:rPr>
+      </w:pPr>
+      <w:r>
+        <w:rPr>
+          <w:rFonts w:ascii="Calibri" w:cs="Calibri" w:eastAsia="Calibri" w:hAnsi="Calibri"/>
+          <w:rtl w:val="0"/>
+        </w:rPr>
+        <w:t xml:space="preserve">Hands: Aerofibril Bracers</w:t>
+      </w:r>
+    </w:p>
+    <w:p>
+      <w:pPr>
+        <w:numPr>
+          <w:ilvl w:val="2"/>
+          <w:numId w:val="2"/>
+        </w:numPr>
+        <w:spacing w:line="259" w:lineRule="auto"/>
+        <w:ind w:left="2160" w:hanging="360"/>
+        <w:rPr>
+          <w:rFonts w:ascii="Noto Sans Symbols" w:cs="Noto Sans Symbols" w:eastAsia="Noto Sans Symbols" w:hAnsi="Noto Sans Symbols"/>
+        </w:rPr>
+      </w:pPr>
+      <w:r>
+        <w:rPr>
+          <w:rFonts w:ascii="Calibri" w:cs="Calibri" w:eastAsia="Calibri" w:hAnsi="Calibri"/>
+          <w:rtl w:val="0"/>
+        </w:rPr>
+        <w:t xml:space="preserve">Neck: Amulet of Cooling Ice (Great Quality or better Amulet of Eel instead if you have one)</w:t>
+      </w:r>
+    </w:p>
+    <w:p>
+      <w:pPr>
+        <w:numPr>
+          <w:ilvl w:val="2"/>
+          <w:numId w:val="2"/>
+        </w:numPr>
+        <w:spacing w:line="259" w:lineRule="auto"/>
+        <w:ind w:left="2160" w:hanging="360"/>
+        <w:rPr>
+          <w:rFonts w:ascii="Noto Sans Symbols" w:cs="Noto Sans Symbols" w:eastAsia="Noto Sans Symbols" w:hAnsi="Noto Sans Symbols"/>
+        </w:rPr>
+      </w:pPr>
+      <w:r>
+        <w:rPr>
+          <w:rFonts w:ascii="Calibri" w:cs="Calibri" w:eastAsia="Calibri" w:hAnsi="Calibri"/>
+          <w:rtl w:val="0"/>
+        </w:rPr>
+        <w:t xml:space="preserve">Chest: Aerofibril Plastron</w:t>
+      </w:r>
+    </w:p>
+    <w:p>
+      <w:pPr>
+        <w:numPr>
+          <w:ilvl w:val="2"/>
+          <w:numId w:val="2"/>
+        </w:numPr>
+        <w:spacing w:line="259" w:lineRule="auto"/>
+        <w:ind w:left="2160" w:hanging="360"/>
+        <w:rPr>
+          <w:rFonts w:ascii="Noto Sans Symbols" w:cs="Noto Sans Symbols" w:eastAsia="Noto Sans Symbols" w:hAnsi="Noto Sans Symbols"/>
+        </w:rPr>
+      </w:pPr>
+      <w:r>
+        <w:rPr>
+          <w:rFonts w:ascii="Calibri" w:cs="Calibri" w:eastAsia="Calibri" w:hAnsi="Calibri"/>
+          <w:rtl w:val="0"/>
+        </w:rPr>
+        <w:t xml:space="preserve">Legs: Flowy Trousers</w:t>
+      </w:r>
+    </w:p>
+    <w:p>
+      <w:pPr>
+        <w:numPr>
+          <w:ilvl w:val="2"/>
+          <w:numId w:val="2"/>
+        </w:numPr>
+        <w:spacing w:line="259" w:lineRule="auto"/>
+        <w:ind w:left="2160" w:hanging="360"/>
+        <w:rPr>
+          <w:rFonts w:ascii="Noto Sans Symbols" w:cs="Noto Sans Symbols" w:eastAsia="Noto Sans Symbols" w:hAnsi="Noto Sans Symbols"/>
+        </w:rPr>
+      </w:pPr>
+      <w:r>
+        <w:rPr>
+          <w:rFonts w:ascii="Calibri" w:cs="Calibri" w:eastAsia="Calibri" w:hAnsi="Calibri"/>
+          <w:rtl w:val="0"/>
+        </w:rPr>
+        <w:t xml:space="preserve">Rings: Silver (or Gold) Ruby Ring x2 (Steprings are roughly equivalent to Great quality Ruby Rings)</w:t>
+      </w:r>
+    </w:p>
+    <w:p>
+      <w:pPr>
+        <w:numPr>
+          <w:ilvl w:val="2"/>
+          <w:numId w:val="2"/>
+        </w:numPr>
+        <w:spacing w:line="259" w:lineRule="auto"/>
+        <w:ind w:left="2160" w:hanging="360"/>
+        <w:rPr>
+          <w:rFonts w:ascii="Noto Sans Symbols" w:cs="Noto Sans Symbols" w:eastAsia="Noto Sans Symbols" w:hAnsi="Noto Sans Symbols"/>
+        </w:rPr>
+      </w:pPr>
+      <w:r>
+        <w:rPr>
+          <w:rFonts w:ascii="Calibri" w:cs="Calibri" w:eastAsia="Calibri" w:hAnsi="Calibri"/>
+          <w:rtl w:val="0"/>
+        </w:rPr>
+        <w:t xml:space="preserve">Feet: Oak Skis (Replace with Bert’s Super-Skis when you can)</w:t>
+      </w:r>
+    </w:p>
+    <w:p>
+      <w:pPr>
+        <w:numPr>
+          <w:ilvl w:val="2"/>
+          <w:numId w:val="2"/>
+        </w:numPr>
+        <w:spacing w:line="259" w:lineRule="auto"/>
+        <w:ind w:left="2160" w:hanging="360"/>
+        <w:rPr>
+          <w:rFonts w:ascii="Noto Sans Symbols" w:cs="Noto Sans Symbols" w:eastAsia="Noto Sans Symbols" w:hAnsi="Noto Sans Symbols"/>
+        </w:rPr>
+      </w:pPr>
+      <w:r>
+        <w:rPr>
+          <w:rFonts w:ascii="Calibri" w:cs="Calibri" w:eastAsia="Calibri" w:hAnsi="Calibri"/>
+          <w:rtl w:val="0"/>
+        </w:rPr>
+        <w:t xml:space="preserve">Tools: Greedy Piggy Bank, Water Bottle, Rusted Spyglass, Trash Grabber, Omni-tool (Replace with Mountaineering Guidebook when you can)</w:t>
+      </w:r>
+    </w:p>
+    <w:p>
+      <w:pPr>
+        <w:numPr>
+          <w:ilvl w:val="2"/>
+          <w:numId w:val="2"/>
+        </w:numPr>
+        <w:spacing w:line="259" w:lineRule="auto"/>
+        <w:ind w:left="2160" w:hanging="360"/>
+        <w:rPr>
+          <w:rFonts w:ascii="Noto Sans Symbols" w:cs="Noto Sans Symbols" w:eastAsia="Noto Sans Symbols" w:hAnsi="Noto Sans Symbols"/>
+        </w:rPr>
+      </w:pPr>
+      <w:r>
+        <w:rPr>
+          <w:rFonts w:ascii="Calibri" w:cs="Calibri" w:eastAsia="Calibri" w:hAnsi="Calibri"/>
+          <w:rtl w:val="0"/>
+        </w:rPr>
+        <w:t xml:space="preserve">Consumable: Jelly Sandwich</w:t>
+      </w:r>
+    </w:p>
+    <w:p>
+      <w:pPr>
+        <w:numPr>
+          <w:ilvl w:val="0"/>
+          <w:numId w:val="2"/>
+        </w:numPr>
+        <w:spacing w:line="259" w:lineRule="auto"/>
+        <w:ind w:left="720" w:hanging="360"/>
+        <w:rPr>
+          <w:rFonts w:ascii="Noto Sans Symbols" w:cs="Noto Sans Symbols" w:eastAsia="Noto Sans Symbols" w:hAnsi="Noto Sans Symbols"/>
+        </w:rPr>
+      </w:pPr>
+      <w:r>
+        <w:rPr>
+          <w:rFonts w:ascii="Calibri" w:cs="Calibri" w:eastAsia="Calibri" w:hAnsi="Calibri"/>
+          <w:rtl w:val="0"/>
+        </w:rPr>
+        <w:t xml:space="preserve">Go to the Horn of Respite</w:t>
+      </w:r>
+    </w:p>
+    <w:p>
+      <w:pPr>
+        <w:numPr>
+          <w:ilvl w:val="0"/>
+          <w:numId w:val="2"/>
+        </w:numPr>
+        <w:spacing w:line="259" w:lineRule="auto"/>
+        <w:ind w:left="720" w:hanging="360"/>
+        <w:rPr>
+          <w:rFonts w:ascii="Noto Sans Symbols" w:cs="Noto Sans Symbols" w:eastAsia="Noto Sans Symbols" w:hAnsi="Noto Sans Symbols"/>
+        </w:rPr>
+      </w:pPr>
+      <w:r>
+        <w:rPr>
+          <w:rFonts w:ascii="Calibri" w:cs="Calibri" w:eastAsia="Calibri" w:hAnsi="Calibri"/>
+          <w:rtl w:val="0"/>
+        </w:rPr>
+        <w:t xml:space="preserve">Do Rescue Team until you have 100 total Adventurer’s Guild Tokens for </w:t>
+      </w:r>
+      <w:r>
+        <w:rPr>
+          <w:rFonts w:ascii="Calibri" w:cs="Calibri" w:eastAsia="Calibri" w:hAnsi="Calibri"/>
+          <w:b w:val="1"/>
+          <w:bCs w:val="1"/>
+          <w:rtl w:val="0"/>
+        </w:rPr>
+        <w:t xml:space="preserve">!!Black Eye Peak Wilderness Permit</w:t>
+      </w:r>
+      <w:r>
+        <w:rPr>
+          <w:rFonts w:ascii="Calibri" w:cs="Calibri" w:eastAsia="Calibri" w:hAnsi="Calibri"/>
+          <w:rtl w:val="0"/>
+        </w:rPr>
+        <w:t xml:space="preserve"> </w:t>
+      </w:r>
+      <w:r>
+        <w:rPr>
+          <w:rFonts w:ascii="Calibri" w:cs="Calibri" w:eastAsia="Calibri" w:hAnsi="Calibri"/>
+          <w:b w:val="1"/>
+          <w:bCs w:val="1"/>
+          <w:rtl w:val="0"/>
+        </w:rPr>
+        <w:t xml:space="preserve">[Collectible 15]</w:t>
+      </w:r>
+      <w:r>
+        <w:rPr>
+          <w:rtl w:val="0"/>
+        </w:rPr>
+      </w:r>
+    </w:p>
+    <w:p>
+      <w:pPr>
+        <w:numPr>
+          <w:ilvl w:val="0"/>
+          <w:numId w:val="2"/>
+        </w:numPr>
+        <w:spacing w:line="259" w:lineRule="auto"/>
+        <w:ind w:left="720" w:hanging="360"/>
+        <w:rPr>
+          <w:rFonts w:ascii="Noto Sans Symbols" w:cs="Noto Sans Symbols" w:eastAsia="Noto Sans Symbols" w:hAnsi="Noto Sans Symbols"/>
+        </w:rPr>
+      </w:pPr>
+      <w:r>
+        <w:rPr>
+          <w:rFonts w:ascii="Calibri" w:cs="Calibri" w:eastAsia="Calibri" w:hAnsi="Calibri"/>
+          <w:rtl w:val="0"/>
+        </w:rPr>
+        <w:t xml:space="preserve">Equip your Wanderlust Walking Stick (in place of the Trash Grabber)</w:t>
+      </w:r>
+    </w:p>
+    <w:p>
+      <w:pPr>
+        <w:numPr>
+          <w:ilvl w:val="0"/>
+          <w:numId w:val="2"/>
+        </w:numPr>
+        <w:spacing w:line="259" w:lineRule="auto"/>
+        <w:ind w:left="720" w:hanging="360"/>
+        <w:rPr>
+          <w:rFonts w:ascii="Noto Sans Symbols" w:cs="Noto Sans Symbols" w:eastAsia="Noto Sans Symbols" w:hAnsi="Noto Sans Symbols"/>
+        </w:rPr>
+      </w:pPr>
+      <w:r>
+        <w:rPr>
+          <w:rFonts w:ascii="Calibri" w:cs="Calibri" w:eastAsia="Calibri" w:hAnsi="Calibri"/>
+          <w:rtl w:val="0"/>
+        </w:rPr>
+        <w:t xml:space="preserve">Go South and South from the Horn of Respite to Black Eye Peak</w:t>
+      </w:r>
+    </w:p>
+    <w:p>
+      <w:pPr>
+        <w:numPr>
+          <w:ilvl w:val="0"/>
+          <w:numId w:val="2"/>
+        </w:numPr>
+        <w:spacing w:line="259" w:lineRule="auto"/>
+        <w:ind w:left="720" w:hanging="360"/>
+        <w:rPr>
+          <w:rFonts w:ascii="Noto Sans Symbols" w:cs="Noto Sans Symbols" w:eastAsia="Noto Sans Symbols" w:hAnsi="Noto Sans Symbols"/>
+        </w:rPr>
+      </w:pPr>
+      <w:r>
+        <w:rPr>
+          <w:rFonts w:ascii="Calibri" w:cs="Calibri" w:eastAsia="Calibri" w:hAnsi="Calibri"/>
+          <w:rtl w:val="0"/>
+        </w:rPr>
+        <w:t xml:space="preserve">Do Ridge Scrambling for </w:t>
+      </w:r>
+      <w:r>
+        <w:rPr>
+          <w:rFonts w:ascii="Calibri" w:cs="Calibri" w:eastAsia="Calibri" w:hAnsi="Calibri"/>
+          <w:b w:val="1"/>
+          <w:bCs w:val="1"/>
+          <w:rtl w:val="0"/>
+        </w:rPr>
+        <w:t xml:space="preserve">!!Mountaineering Guidebook</w:t>
+      </w:r>
+    </w:p>
+    <w:p>
+      <w:pPr>
+        <w:numPr>
+          <w:ilvl w:val="0"/>
+          <w:numId w:val="2"/>
+        </w:numPr>
+        <w:spacing w:line="259" w:lineRule="auto"/>
+        <w:ind w:left="720" w:hanging="360"/>
+        <w:rPr>
+          <w:rFonts w:ascii="Calibri" w:cs="Calibri" w:eastAsia="Calibri" w:hAnsi="Calibri"/>
+        </w:rPr>
+      </w:pPr>
+      <w:r>
+        <w:rPr>
+          <w:rFonts w:ascii="Calibri" w:cs="Calibri" w:eastAsia="Calibri" w:hAnsi="Calibri"/>
+          <w:rtl w:val="0"/>
+        </w:rPr>
+        <w:t xml:space="preserve">Return to the Horn of Respite, equip your Trash Grabber/Mountaineering Guidebook (in place of the Wanderlust Walking Stick/Omni-tool)</w:t>
+      </w:r>
+    </w:p>
+    <w:p>
+      <w:pPr>
+        <w:numPr>
+          <w:ilvl w:val="0"/>
+          <w:numId w:val="2"/>
+        </w:numPr>
+        <w:spacing w:line="259" w:lineRule="auto"/>
+        <w:ind w:left="720" w:hanging="360"/>
+        <w:rPr>
+          <w:rFonts w:ascii="Calibri" w:cs="Calibri" w:eastAsia="Calibri" w:hAnsi="Calibri"/>
+        </w:rPr>
+      </w:pPr>
+      <w:r>
+        <w:rPr>
+          <w:rFonts w:ascii="Calibri" w:cs="Calibri" w:eastAsia="Calibri" w:hAnsi="Calibri"/>
+          <w:rtl w:val="0"/>
+        </w:rPr>
+        <w:t xml:space="preserve">Do Rescue Team again for a total of 20 Unidentified Remains (part of an achievement) and 1000 tokens to purchase </w:t>
+      </w:r>
+      <w:r>
+        <w:rPr>
+          <w:rFonts w:ascii="Calibri" w:cs="Calibri" w:eastAsia="Calibri" w:hAnsi="Calibri"/>
+          <w:b w:val="1"/>
+          <w:bCs w:val="1"/>
+          <w:rtl w:val="0"/>
+        </w:rPr>
+        <w:t xml:space="preserve">!!Bert’s Super-Skis, !!Bolstered Quiver</w:t>
+      </w:r>
+      <w:r>
+        <w:rPr>
+          <w:rFonts w:ascii="Calibri" w:cs="Calibri" w:eastAsia="Calibri" w:hAnsi="Calibri"/>
+          <w:rtl w:val="0"/>
+        </w:rPr>
+        <w:t xml:space="preserve">, and </w:t>
+      </w:r>
+      <w:r>
+        <w:rPr>
+          <w:rFonts w:ascii="Calibri" w:cs="Calibri" w:eastAsia="Calibri" w:hAnsi="Calibri"/>
+          <w:b w:val="1"/>
+          <w:bCs w:val="1"/>
+          <w:rtl w:val="0"/>
+        </w:rPr>
+        <w:t xml:space="preserve">!!Mysterious Northern Map</w:t>
+      </w:r>
+      <w:r>
+        <w:rPr>
+          <w:rFonts w:ascii="Calibri" w:cs="Calibri" w:eastAsia="Calibri" w:hAnsi="Calibri"/>
+          <w:rtl w:val="0"/>
+        </w:rPr>
+        <w:t xml:space="preserve"> </w:t>
+      </w:r>
+      <w:r>
+        <w:rPr>
+          <w:rFonts w:ascii="Calibri" w:cs="Calibri" w:eastAsia="Calibri" w:hAnsi="Calibri"/>
+          <w:b w:val="1"/>
+          <w:bCs w:val="1"/>
+          <w:rtl w:val="0"/>
+        </w:rPr>
+        <w:t xml:space="preserve">[Collectible 16]</w:t>
+      </w:r>
+      <w:r>
+        <w:rPr>
+          <w:rtl w:val="0"/>
+        </w:rPr>
       </w:r>
     </w:p>
     <w:p>
@@ -11424,460 +12137,120 @@
         <w:spacing w:line="259" w:lineRule="auto"/>
         <w:ind w:left="1440" w:hanging="360"/>
         <w:rPr>
-          <w:rFonts w:ascii="Courier New" w:cs="Courier New" w:eastAsia="Courier New" w:hAnsi="Courier New"/>
-        </w:rPr>
-      </w:pPr>
-      <w:r>
-        <w:rPr>
-          <w:rFonts w:ascii="Calibri" w:cs="Calibri" w:eastAsia="Calibri" w:hAnsi="Calibri"/>
-          <w:rtl w:val="0"/>
-        </w:rPr>
-        <w:t xml:space="preserve">Here is an example loadout:</w:t>
-      </w:r>
-    </w:p>
-    <w:p>
-      <w:pPr>
-        <w:numPr>
-          <w:ilvl w:val="2"/>
+          <w:rFonts w:ascii="Calibri" w:cs="Calibri" w:eastAsia="Calibri" w:hAnsi="Calibri"/>
+        </w:rPr>
+      </w:pPr>
+      <w:r>
+        <w:rPr>
+          <w:rFonts w:ascii="Calibri" w:cs="Calibri" w:eastAsia="Calibri" w:hAnsi="Calibri"/>
+          <w:rtl w:val="0"/>
+        </w:rPr>
+        <w:t xml:space="preserve">Be prepared to spend quite a few steps on this one, the gear listed above will give about 1 token every 275-285 steps (depending on if you have Bert’s Skiis equipped).</w:t>
+      </w:r>
+    </w:p>
+    <w:p>
+      <w:pPr>
+        <w:numPr>
+          <w:ilvl w:val="0"/>
           <w:numId w:val="2"/>
         </w:numPr>
         <w:spacing w:line="259" w:lineRule="auto"/>
-        <w:ind w:left="2160" w:hanging="360"/>
-        <w:rPr>
-          <w:rFonts w:ascii="Noto Sans Symbols" w:cs="Noto Sans Symbols" w:eastAsia="Noto Sans Symbols" w:hAnsi="Noto Sans Symbols"/>
-        </w:rPr>
-      </w:pPr>
-      <w:r>
-        <w:rPr>
-          <w:rFonts w:ascii="Calibri" w:cs="Calibri" w:eastAsia="Calibri" w:hAnsi="Calibri"/>
-          <w:rtl w:val="0"/>
-        </w:rPr>
-        <w:t xml:space="preserve">Cape: Feather Cape</w:t>
-      </w:r>
-    </w:p>
-    <w:p>
-      <w:pPr>
-        <w:numPr>
-          <w:ilvl w:val="2"/>
+        <w:ind w:left="720" w:hanging="360"/>
+        <w:rPr>
+          <w:rFonts w:ascii="Calibri" w:cs="Calibri" w:eastAsia="Calibri" w:hAnsi="Calibri"/>
+        </w:rPr>
+      </w:pPr>
+      <w:r>
+        <w:rPr>
+          <w:rFonts w:ascii="Calibri" w:cs="Calibri" w:eastAsia="Calibri" w:hAnsi="Calibri"/>
+          <w:rtl w:val="0"/>
+        </w:rPr>
+        <w:t xml:space="preserve">Return to Jarvonia and get your best </w:t>
+      </w:r>
+      <w:r>
+        <w:rPr>
+          <w:rFonts w:ascii="Calibri" w:cs="Calibri" w:eastAsia="Calibri" w:hAnsi="Calibri"/>
+          <w:b w:val="1"/>
+          <w:bCs w:val="1"/>
+          <w:rtl w:val="0"/>
+        </w:rPr>
+        <w:t xml:space="preserve">Efficiency Hunting</w:t>
+      </w:r>
+      <w:r>
+        <w:rPr>
+          <w:rFonts w:ascii="Calibri" w:cs="Calibri" w:eastAsia="Calibri" w:hAnsi="Calibri"/>
+          <w:rtl w:val="0"/>
+        </w:rPr>
+        <w:t xml:space="preserve"> gear along with a Hunting Bow and your level 20+ arrows.</w:t>
+      </w:r>
+    </w:p>
+    <w:p>
+      <w:pPr>
+        <w:numPr>
+          <w:ilvl w:val="0"/>
           <w:numId w:val="2"/>
         </w:numPr>
         <w:spacing w:line="259" w:lineRule="auto"/>
-        <w:ind w:left="2160" w:hanging="360"/>
-        <w:rPr>
-          <w:rFonts w:ascii="Noto Sans Symbols" w:cs="Noto Sans Symbols" w:eastAsia="Noto Sans Symbols" w:hAnsi="Noto Sans Symbols"/>
-        </w:rPr>
-      </w:pPr>
-      <w:r>
-        <w:rPr>
-          <w:rFonts w:ascii="Calibri" w:cs="Calibri" w:eastAsia="Calibri" w:hAnsi="Calibri"/>
-          <w:rtl w:val="0"/>
-        </w:rPr>
-        <w:t xml:space="preserve">Back: Grappling Hook (or Lily Pad if you have it)</w:t>
-      </w:r>
-    </w:p>
-    <w:p>
-      <w:pPr>
-        <w:numPr>
-          <w:ilvl w:val="2"/>
+        <w:ind w:left="720" w:hanging="360"/>
+        <w:rPr>
+          <w:rFonts w:ascii="Calibri" w:cs="Calibri" w:eastAsia="Calibri" w:hAnsi="Calibri"/>
+        </w:rPr>
+      </w:pPr>
+      <w:r>
+        <w:rPr>
+          <w:rFonts w:ascii="Calibri" w:cs="Calibri" w:eastAsia="Calibri" w:hAnsi="Calibri"/>
+          <w:rtl w:val="0"/>
+        </w:rPr>
+        <w:t xml:space="preserve">Go to Nomad Woods and do Bear hunting 100 times </w:t>
+      </w:r>
+      <w:r>
+        <w:rPr>
+          <w:rFonts w:ascii="Calibri" w:cs="Calibri" w:eastAsia="Calibri" w:hAnsi="Calibri"/>
+          <w:b w:val="1"/>
+          <w:bCs w:val="1"/>
+          <w:rtl w:val="0"/>
+        </w:rPr>
+        <w:t xml:space="preserve">[Hard Achievement 4]</w:t>
+      </w:r>
+    </w:p>
+    <w:p>
+      <w:pPr>
+        <w:numPr>
+          <w:ilvl w:val="0"/>
           <w:numId w:val="2"/>
         </w:numPr>
         <w:spacing w:line="259" w:lineRule="auto"/>
-        <w:ind w:left="2160" w:hanging="360"/>
-        <w:rPr>
-          <w:rFonts w:ascii="Noto Sans Symbols" w:cs="Noto Sans Symbols" w:eastAsia="Noto Sans Symbols" w:hAnsi="Noto Sans Symbols"/>
-        </w:rPr>
-      </w:pPr>
-      <w:r>
-        <w:rPr>
-          <w:rFonts w:ascii="Calibri" w:cs="Calibri" w:eastAsia="Calibri" w:hAnsi="Calibri"/>
-          <w:rtl w:val="0"/>
-        </w:rPr>
-        <w:t xml:space="preserve">Head: Running Visor</w:t>
-      </w:r>
-    </w:p>
-    <w:p>
-      <w:pPr>
-        <w:numPr>
-          <w:ilvl w:val="2"/>
+        <w:ind w:left="720" w:hanging="360"/>
+        <w:rPr>
+          <w:rFonts w:ascii="Calibri" w:cs="Calibri" w:eastAsia="Calibri" w:hAnsi="Calibri"/>
+        </w:rPr>
+      </w:pPr>
+      <w:r>
+        <w:rPr>
+          <w:rFonts w:ascii="Calibri" w:cs="Calibri" w:eastAsia="Calibri" w:hAnsi="Calibri"/>
+          <w:rtl w:val="0"/>
+        </w:rPr>
+        <w:t xml:space="preserve">We now need to actively work on Jarvonia reputation, we can pair this with the 5,000 trees and 10,000 ore achievements.</w:t>
+      </w:r>
+    </w:p>
+    <w:p>
+      <w:pPr>
+        <w:numPr>
+          <w:ilvl w:val="0"/>
           <w:numId w:val="2"/>
         </w:numPr>
         <w:spacing w:line="259" w:lineRule="auto"/>
-        <w:ind w:left="2160" w:hanging="360"/>
-        <w:rPr>
-          <w:rFonts w:ascii="Noto Sans Symbols" w:cs="Noto Sans Symbols" w:eastAsia="Noto Sans Symbols" w:hAnsi="Noto Sans Symbols"/>
-        </w:rPr>
-      </w:pPr>
-      <w:r>
-        <w:rPr>
-          <w:rFonts w:ascii="Calibri" w:cs="Calibri" w:eastAsia="Calibri" w:hAnsi="Calibri"/>
-          <w:rtl w:val="0"/>
-        </w:rPr>
-        <w:t xml:space="preserve">Hands: Aerofibril Bracers</w:t>
-      </w:r>
-    </w:p>
-    <w:p>
-      <w:pPr>
-        <w:numPr>
-          <w:ilvl w:val="2"/>
-          <w:numId w:val="2"/>
-        </w:numPr>
-        <w:spacing w:line="259" w:lineRule="auto"/>
-        <w:ind w:left="2160" w:hanging="360"/>
-        <w:rPr>
-          <w:rFonts w:ascii="Noto Sans Symbols" w:cs="Noto Sans Symbols" w:eastAsia="Noto Sans Symbols" w:hAnsi="Noto Sans Symbols"/>
-        </w:rPr>
-      </w:pPr>
-      <w:r>
-        <w:rPr>
-          <w:rFonts w:ascii="Calibri" w:cs="Calibri" w:eastAsia="Calibri" w:hAnsi="Calibri"/>
-          <w:rtl w:val="0"/>
-        </w:rPr>
-        <w:t xml:space="preserve">Neck: Amulet of Cooling Ice (Great Quality or better Amulet of Eel instead if you have one)</w:t>
-      </w:r>
-    </w:p>
-    <w:p>
-      <w:pPr>
-        <w:numPr>
-          <w:ilvl w:val="2"/>
-          <w:numId w:val="2"/>
-        </w:numPr>
-        <w:spacing w:line="259" w:lineRule="auto"/>
-        <w:ind w:left="2160" w:hanging="360"/>
-        <w:rPr>
-          <w:rFonts w:ascii="Noto Sans Symbols" w:cs="Noto Sans Symbols" w:eastAsia="Noto Sans Symbols" w:hAnsi="Noto Sans Symbols"/>
-        </w:rPr>
-      </w:pPr>
-      <w:r>
-        <w:rPr>
-          <w:rFonts w:ascii="Calibri" w:cs="Calibri" w:eastAsia="Calibri" w:hAnsi="Calibri"/>
-          <w:rtl w:val="0"/>
-        </w:rPr>
-        <w:t xml:space="preserve">Chest: Aerofibril Plastron</w:t>
-      </w:r>
-    </w:p>
-    <w:p>
-      <w:pPr>
-        <w:numPr>
-          <w:ilvl w:val="2"/>
-          <w:numId w:val="2"/>
-        </w:numPr>
-        <w:spacing w:line="259" w:lineRule="auto"/>
-        <w:ind w:left="2160" w:hanging="360"/>
-        <w:rPr>
-          <w:rFonts w:ascii="Noto Sans Symbols" w:cs="Noto Sans Symbols" w:eastAsia="Noto Sans Symbols" w:hAnsi="Noto Sans Symbols"/>
-        </w:rPr>
-      </w:pPr>
-      <w:r>
-        <w:rPr>
-          <w:rFonts w:ascii="Calibri" w:cs="Calibri" w:eastAsia="Calibri" w:hAnsi="Calibri"/>
-          <w:rtl w:val="0"/>
-        </w:rPr>
-        <w:t xml:space="preserve">Legs: Flowy Trousers</w:t>
-      </w:r>
-    </w:p>
-    <w:p>
-      <w:pPr>
-        <w:numPr>
-          <w:ilvl w:val="2"/>
-          <w:numId w:val="2"/>
-        </w:numPr>
-        <w:spacing w:line="259" w:lineRule="auto"/>
-        <w:ind w:left="2160" w:hanging="360"/>
-        <w:rPr>
-          <w:rFonts w:ascii="Noto Sans Symbols" w:cs="Noto Sans Symbols" w:eastAsia="Noto Sans Symbols" w:hAnsi="Noto Sans Symbols"/>
-        </w:rPr>
-      </w:pPr>
-      <w:r>
-        <w:rPr>
-          <w:rFonts w:ascii="Calibri" w:cs="Calibri" w:eastAsia="Calibri" w:hAnsi="Calibri"/>
-          <w:rtl w:val="0"/>
-        </w:rPr>
-        <w:t xml:space="preserve">Rings: Silver (or Gold) Ruby Ring x2 (Steprings are roughly equivalent to Great quality Ruby Rings)</w:t>
-      </w:r>
-    </w:p>
-    <w:p>
-      <w:pPr>
-        <w:numPr>
-          <w:ilvl w:val="2"/>
-          <w:numId w:val="2"/>
-        </w:numPr>
-        <w:spacing w:line="259" w:lineRule="auto"/>
-        <w:ind w:left="2160" w:hanging="360"/>
-        <w:rPr>
-          <w:rFonts w:ascii="Noto Sans Symbols" w:cs="Noto Sans Symbols" w:eastAsia="Noto Sans Symbols" w:hAnsi="Noto Sans Symbols"/>
-        </w:rPr>
-      </w:pPr>
-      <w:r>
-        <w:rPr>
-          <w:rFonts w:ascii="Calibri" w:cs="Calibri" w:eastAsia="Calibri" w:hAnsi="Calibri"/>
-          <w:rtl w:val="0"/>
-        </w:rPr>
-        <w:t xml:space="preserve">Feet: Oak Skis (Replace with Bert’s Super-Skis when you can)</w:t>
-      </w:r>
-    </w:p>
-    <w:p>
-      <w:pPr>
-        <w:numPr>
-          <w:ilvl w:val="2"/>
-          <w:numId w:val="2"/>
-        </w:numPr>
-        <w:spacing w:line="259" w:lineRule="auto"/>
-        <w:ind w:left="2160" w:hanging="360"/>
-        <w:rPr>
-          <w:rFonts w:ascii="Noto Sans Symbols" w:cs="Noto Sans Symbols" w:eastAsia="Noto Sans Symbols" w:hAnsi="Noto Sans Symbols"/>
-        </w:rPr>
-      </w:pPr>
-      <w:r>
-        <w:rPr>
-          <w:rFonts w:ascii="Calibri" w:cs="Calibri" w:eastAsia="Calibri" w:hAnsi="Calibri"/>
-          <w:rtl w:val="0"/>
-        </w:rPr>
-        <w:t xml:space="preserve">Tools: Greedy Piggy Bank, Water Bottle, Rusted Spyglass, Trash Grabber, Omni-tool (Replace with Mountaineering Guidebook when you can)</w:t>
-      </w:r>
-    </w:p>
-    <w:p>
-      <w:pPr>
-        <w:numPr>
-          <w:ilvl w:val="2"/>
-          <w:numId w:val="2"/>
-        </w:numPr>
-        <w:spacing w:line="259" w:lineRule="auto"/>
-        <w:ind w:left="2160" w:hanging="360"/>
-        <w:rPr>
-          <w:rFonts w:ascii="Noto Sans Symbols" w:cs="Noto Sans Symbols" w:eastAsia="Noto Sans Symbols" w:hAnsi="Noto Sans Symbols"/>
-        </w:rPr>
-      </w:pPr>
-      <w:r>
-        <w:rPr>
-          <w:rFonts w:ascii="Calibri" w:cs="Calibri" w:eastAsia="Calibri" w:hAnsi="Calibri"/>
-          <w:rtl w:val="0"/>
-        </w:rPr>
-        <w:t xml:space="preserve">Consumable: Jelly Sandwich</w:t>
-      </w:r>
-    </w:p>
-    <w:p>
-      <w:pPr>
-        <w:numPr>
-          <w:ilvl w:val="0"/>
-          <w:numId w:val="2"/>
-        </w:numPr>
-        <w:spacing w:line="259" w:lineRule="auto"/>
-        <w:ind w:left="720" w:hanging="360"/>
-        <w:rPr>
-          <w:rFonts w:ascii="Noto Sans Symbols" w:cs="Noto Sans Symbols" w:eastAsia="Noto Sans Symbols" w:hAnsi="Noto Sans Symbols"/>
-        </w:rPr>
-      </w:pPr>
-      <w:r>
-        <w:rPr>
-          <w:rFonts w:ascii="Calibri" w:cs="Calibri" w:eastAsia="Calibri" w:hAnsi="Calibri"/>
-          <w:rtl w:val="0"/>
-        </w:rPr>
-        <w:t xml:space="preserve">Go to the Horn of Respite</w:t>
-      </w:r>
-    </w:p>
-    <w:p>
-      <w:pPr>
-        <w:numPr>
-          <w:ilvl w:val="0"/>
-          <w:numId w:val="2"/>
-        </w:numPr>
-        <w:spacing w:line="259" w:lineRule="auto"/>
-        <w:ind w:left="720" w:hanging="360"/>
-        <w:rPr>
-          <w:rFonts w:ascii="Noto Sans Symbols" w:cs="Noto Sans Symbols" w:eastAsia="Noto Sans Symbols" w:hAnsi="Noto Sans Symbols"/>
-        </w:rPr>
-      </w:pPr>
-      <w:r>
-        <w:rPr>
-          <w:rFonts w:ascii="Calibri" w:cs="Calibri" w:eastAsia="Calibri" w:hAnsi="Calibri"/>
-          <w:rtl w:val="0"/>
-        </w:rPr>
-        <w:t xml:space="preserve">Do Rescue Team until you have 100 total Adventurer’s Guild Tokens for </w:t>
-      </w:r>
-      <w:r>
-        <w:rPr>
-          <w:rFonts w:ascii="Calibri" w:cs="Calibri" w:eastAsia="Calibri" w:hAnsi="Calibri"/>
-          <w:b w:val="1"/>
-          <w:bCs w:val="1"/>
-          <w:rtl w:val="0"/>
-        </w:rPr>
-        <w:t xml:space="preserve">!!Black Eye Peak Wilderness Permit</w:t>
-      </w:r>
-      <w:r>
-        <w:rPr>
-          <w:rFonts w:ascii="Calibri" w:cs="Calibri" w:eastAsia="Calibri" w:hAnsi="Calibri"/>
-          <w:rtl w:val="0"/>
-        </w:rPr>
-        <w:t xml:space="preserve"> </w:t>
-      </w:r>
-      <w:r>
-        <w:rPr>
-          <w:rFonts w:ascii="Calibri" w:cs="Calibri" w:eastAsia="Calibri" w:hAnsi="Calibri"/>
-          <w:b w:val="1"/>
-          <w:bCs w:val="1"/>
-          <w:rtl w:val="0"/>
-        </w:rPr>
-        <w:t xml:space="preserve">[Collectible 15]</w:t>
-      </w:r>
-      <w:r>
-        <w:rPr>
-          <w:rtl w:val="0"/>
-        </w:rPr>
-      </w:r>
-    </w:p>
-    <w:p>
-      <w:pPr>
-        <w:numPr>
-          <w:ilvl w:val="0"/>
-          <w:numId w:val="2"/>
-        </w:numPr>
-        <w:spacing w:line="259" w:lineRule="auto"/>
-        <w:ind w:left="720" w:hanging="360"/>
-        <w:rPr>
-          <w:rFonts w:ascii="Noto Sans Symbols" w:cs="Noto Sans Symbols" w:eastAsia="Noto Sans Symbols" w:hAnsi="Noto Sans Symbols"/>
-        </w:rPr>
-      </w:pPr>
-      <w:r>
-        <w:rPr>
-          <w:rFonts w:ascii="Calibri" w:cs="Calibri" w:eastAsia="Calibri" w:hAnsi="Calibri"/>
-          <w:rtl w:val="0"/>
-        </w:rPr>
-        <w:t xml:space="preserve">Equip your and Wanderlust Walking Stick (in place of the Trash Grabber)</w:t>
-      </w:r>
-    </w:p>
-    <w:p>
-      <w:pPr>
-        <w:numPr>
-          <w:ilvl w:val="0"/>
-          <w:numId w:val="2"/>
-        </w:numPr>
-        <w:spacing w:line="259" w:lineRule="auto"/>
-        <w:ind w:left="720" w:hanging="360"/>
-        <w:rPr>
-          <w:rFonts w:ascii="Noto Sans Symbols" w:cs="Noto Sans Symbols" w:eastAsia="Noto Sans Symbols" w:hAnsi="Noto Sans Symbols"/>
-        </w:rPr>
-      </w:pPr>
-      <w:r>
-        <w:rPr>
-          <w:rFonts w:ascii="Calibri" w:cs="Calibri" w:eastAsia="Calibri" w:hAnsi="Calibri"/>
-          <w:rtl w:val="0"/>
-        </w:rPr>
-        <w:t xml:space="preserve">Go South and South from the Horn of Respite to Black Eye Peak</w:t>
-      </w:r>
-    </w:p>
-    <w:p>
-      <w:pPr>
-        <w:numPr>
-          <w:ilvl w:val="0"/>
-          <w:numId w:val="2"/>
-        </w:numPr>
-        <w:spacing w:line="259" w:lineRule="auto"/>
-        <w:ind w:left="720" w:hanging="360"/>
-        <w:rPr>
-          <w:rFonts w:ascii="Noto Sans Symbols" w:cs="Noto Sans Symbols" w:eastAsia="Noto Sans Symbols" w:hAnsi="Noto Sans Symbols"/>
-        </w:rPr>
-      </w:pPr>
-      <w:r>
-        <w:rPr>
-          <w:rFonts w:ascii="Calibri" w:cs="Calibri" w:eastAsia="Calibri" w:hAnsi="Calibri"/>
-          <w:rtl w:val="0"/>
-        </w:rPr>
-        <w:t xml:space="preserve">Do Ridge Scrambling for </w:t>
-      </w:r>
-      <w:r>
-        <w:rPr>
-          <w:rFonts w:ascii="Calibri" w:cs="Calibri" w:eastAsia="Calibri" w:hAnsi="Calibri"/>
-          <w:b w:val="1"/>
-          <w:bCs w:val="1"/>
-          <w:rtl w:val="0"/>
-        </w:rPr>
-        <w:t xml:space="preserve">!!Mountaineering Guidebook</w:t>
-      </w:r>
-    </w:p>
-    <w:p>
-      <w:pPr>
-        <w:numPr>
-          <w:ilvl w:val="0"/>
-          <w:numId w:val="2"/>
-        </w:numPr>
-        <w:spacing w:line="259" w:lineRule="auto"/>
-        <w:ind w:left="720" w:hanging="360"/>
-        <w:rPr>
-          <w:rFonts w:ascii="Calibri" w:cs="Calibri" w:eastAsia="Calibri" w:hAnsi="Calibri"/>
-        </w:rPr>
-      </w:pPr>
-      <w:r>
-        <w:rPr>
-          <w:rFonts w:ascii="Calibri" w:cs="Calibri" w:eastAsia="Calibri" w:hAnsi="Calibri"/>
-          <w:rtl w:val="0"/>
-        </w:rPr>
-        <w:t xml:space="preserve">Return to the Horn of Respite, equip your Trash Grabber/Mountaineering Guidebook (in place of the Wanderlust Walking Stick/Omni-tool)</w:t>
-      </w:r>
-    </w:p>
-    <w:p>
-      <w:pPr>
-        <w:numPr>
-          <w:ilvl w:val="0"/>
-          <w:numId w:val="2"/>
-        </w:numPr>
-        <w:spacing w:line="259" w:lineRule="auto"/>
-        <w:ind w:left="720" w:hanging="360"/>
-        <w:rPr>
-          <w:rFonts w:ascii="Calibri" w:cs="Calibri" w:eastAsia="Calibri" w:hAnsi="Calibri"/>
-        </w:rPr>
-      </w:pPr>
-      <w:r>
-        <w:rPr>
-          <w:rFonts w:ascii="Calibri" w:cs="Calibri" w:eastAsia="Calibri" w:hAnsi="Calibri"/>
-          <w:rtl w:val="0"/>
-        </w:rPr>
-        <w:t xml:space="preserve">Do Rescue Team again for a total of 20 Unidentified Remains (part of an achievement) and 1000 tokens to purchase </w:t>
-      </w:r>
-      <w:r>
-        <w:rPr>
-          <w:rFonts w:ascii="Calibri" w:cs="Calibri" w:eastAsia="Calibri" w:hAnsi="Calibri"/>
-          <w:b w:val="1"/>
-          <w:bCs w:val="1"/>
-          <w:rtl w:val="0"/>
-        </w:rPr>
-        <w:t xml:space="preserve">!!Bert’s Super-Skis, !!Bolstered Quiver</w:t>
-      </w:r>
-      <w:r>
-        <w:rPr>
-          <w:rFonts w:ascii="Calibri" w:cs="Calibri" w:eastAsia="Calibri" w:hAnsi="Calibri"/>
-          <w:rtl w:val="0"/>
-        </w:rPr>
-        <w:t xml:space="preserve">, and </w:t>
-      </w:r>
-      <w:r>
-        <w:rPr>
-          <w:rFonts w:ascii="Calibri" w:cs="Calibri" w:eastAsia="Calibri" w:hAnsi="Calibri"/>
-          <w:b w:val="1"/>
-          <w:bCs w:val="1"/>
-          <w:rtl w:val="0"/>
-        </w:rPr>
-        <w:t xml:space="preserve">!!Mysterious Northern Map</w:t>
-      </w:r>
-      <w:r>
-        <w:rPr>
-          <w:rFonts w:ascii="Calibri" w:cs="Calibri" w:eastAsia="Calibri" w:hAnsi="Calibri"/>
-          <w:rtl w:val="0"/>
-        </w:rPr>
-        <w:t xml:space="preserve"> </w:t>
-      </w:r>
-      <w:r>
-        <w:rPr>
-          <w:rFonts w:ascii="Calibri" w:cs="Calibri" w:eastAsia="Calibri" w:hAnsi="Calibri"/>
-          <w:b w:val="1"/>
-          <w:bCs w:val="1"/>
-          <w:rtl w:val="0"/>
-        </w:rPr>
-        <w:t xml:space="preserve">[Collectible 16]</w:t>
-      </w:r>
-      <w:r>
-        <w:rPr>
-          <w:rtl w:val="0"/>
-        </w:rPr>
+        <w:ind w:left="720" w:hanging="360"/>
+        <w:rPr>
+          <w:rFonts w:ascii="Calibri" w:cs="Calibri" w:eastAsia="Calibri" w:hAnsi="Calibri"/>
+        </w:rPr>
+      </w:pPr>
+      <w:r>
+        <w:rPr>
+          <w:rFonts w:ascii="Calibri" w:cs="Calibri" w:eastAsia="Calibri" w:hAnsi="Calibri"/>
+          <w:rtl w:val="0"/>
+        </w:rPr>
+        <w:t xml:space="preserve">Try to complete every log, plank, ore, and bar job given in both Kallaheim and Azurazera daily until you hit 100 reputation. Any duplicate chest gear like Hand Lanterns or Gold Pans can be turned in too if you don’t want the chips from the Mysterious Merchant as long as you remember to keep one for yourself! If you’re feeling adventurous you can also try your hand at crafting, but your Quality Outcome bonuses probably won’t be great so I wouldn’t try for anything beyond uncommon (green) or rare (blue) quality job requests.</w:t>
       </w:r>
     </w:p>
     <w:p>
@@ -11897,7 +12270,7 @@
           <w:rFonts w:ascii="Calibri" w:cs="Calibri" w:eastAsia="Calibri" w:hAnsi="Calibri"/>
           <w:rtl w:val="0"/>
         </w:rPr>
-        <w:t xml:space="preserve">Be prepared to spend quite a few steps on this one, the gear listed above will give about 1 token every 275-285 steps (depending on if you have Bert’s Skiis equipped).</w:t>
+        <w:t xml:space="preserve">If you finish with all the jobs you can either bank steps for completing tomorrow’s jobs, or do Sledding in Nurturing Nook Springs for even more reputation (especially once you get the Zippy Kicksled at 80 rep)</w:t>
       </w:r>
     </w:p>
     <w:p>
@@ -11917,23 +12290,23 @@
           <w:rFonts w:ascii="Calibri" w:cs="Calibri" w:eastAsia="Calibri" w:hAnsi="Calibri"/>
           <w:rtl w:val="0"/>
         </w:rPr>
-        <w:t xml:space="preserve">Return to Jarvonia and get your best </w:t>
-      </w:r>
-      <w:r>
-        <w:rPr>
-          <w:rFonts w:ascii="Calibri" w:cs="Calibri" w:eastAsia="Calibri" w:hAnsi="Calibri"/>
-          <w:b w:val="1"/>
-          <w:bCs w:val="1"/>
-          <w:rtl w:val="0"/>
-        </w:rPr>
-        <w:t xml:space="preserve">Efficiency Hunting</w:t>
-      </w:r>
-      <w:r>
-        <w:rPr>
-          <w:rFonts w:ascii="Calibri" w:cs="Calibri" w:eastAsia="Calibri" w:hAnsi="Calibri"/>
-          <w:rtl w:val="0"/>
-        </w:rPr>
-        <w:t xml:space="preserve"> gear along with a Hunting Bow and your level 20+ arrows.</w:t>
+        <w:t xml:space="preserve">Take your Hydrilium Diving set out of the bank, equip your best </w:t>
+      </w:r>
+      <w:r>
+        <w:rPr>
+          <w:rFonts w:ascii="Calibri" w:cs="Calibri" w:eastAsia="Calibri" w:hAnsi="Calibri"/>
+          <w:b w:val="1"/>
+          <w:bCs w:val="1"/>
+          <w:rtl w:val="0"/>
+        </w:rPr>
+        <w:t xml:space="preserve">Find Collectibles Net Fishing</w:t>
+      </w:r>
+      <w:r>
+        <w:rPr>
+          <w:rFonts w:ascii="Calibri" w:cs="Calibri" w:eastAsia="Calibri" w:hAnsi="Calibri"/>
+          <w:rtl w:val="0"/>
+        </w:rPr>
+        <w:t xml:space="preserve"> gear and go to Azurazera</w:t>
       </w:r>
     </w:p>
     <w:p>
@@ -11953,56 +12326,37 @@
           <w:rFonts w:ascii="Calibri" w:cs="Calibri" w:eastAsia="Calibri" w:hAnsi="Calibri"/>
           <w:rtl w:val="0"/>
         </w:rPr>
-        <w:t xml:space="preserve">Go to Nomad Woods and do Bear hunting 100 times </w:t>
-      </w:r>
-      <w:r>
-        <w:rPr>
-          <w:rFonts w:ascii="Calibri" w:cs="Calibri" w:eastAsia="Calibri" w:hAnsi="Calibri"/>
-          <w:b w:val="1"/>
-          <w:bCs w:val="1"/>
-          <w:rtl w:val="0"/>
-        </w:rPr>
-        <w:t xml:space="preserve">[Hard Achievement 4]</w:t>
-      </w:r>
-    </w:p>
-    <w:p>
-      <w:pPr>
-        <w:numPr>
-          <w:ilvl w:val="0"/>
-          <w:numId w:val="2"/>
-        </w:numPr>
-        <w:spacing w:line="259" w:lineRule="auto"/>
-        <w:ind w:left="720" w:hanging="360"/>
-        <w:rPr>
-          <w:rFonts w:ascii="Calibri" w:cs="Calibri" w:eastAsia="Calibri" w:hAnsi="Calibri"/>
-        </w:rPr>
-      </w:pPr>
-      <w:r>
-        <w:rPr>
-          <w:rFonts w:ascii="Calibri" w:cs="Calibri" w:eastAsia="Calibri" w:hAnsi="Calibri"/>
-          <w:rtl w:val="0"/>
-        </w:rPr>
-        <w:t xml:space="preserve">We now need to actively work on Jarvonia reputation, we can pair this with the 5,000 trees and 10,000 ore achievements.</w:t>
-      </w:r>
-    </w:p>
-    <w:p>
-      <w:pPr>
-        <w:numPr>
-          <w:ilvl w:val="0"/>
-          <w:numId w:val="2"/>
-        </w:numPr>
-        <w:spacing w:line="259" w:lineRule="auto"/>
-        <w:ind w:left="720" w:hanging="360"/>
-        <w:rPr>
-          <w:rFonts w:ascii="Calibri" w:cs="Calibri" w:eastAsia="Calibri" w:hAnsi="Calibri"/>
-        </w:rPr>
-      </w:pPr>
-      <w:r>
-        <w:rPr>
-          <w:rFonts w:ascii="Calibri" w:cs="Calibri" w:eastAsia="Calibri" w:hAnsi="Calibri"/>
-          <w:rtl w:val="0"/>
-        </w:rPr>
-        <w:t xml:space="preserve">Try to complete every log, plank, ore, and bar job given in both Kallaheim and Azurazera daily until you hit 100 reputation. Any duplicate chest gear like Hand Lanterns or Gold Pans can be turned in too if you don’t want the chips from the Mysterious Merchant as long as you remember to keep one for yourself! If you’re feeling adventurous you can also try your hand at crafting, but your Quality Outcome bonuses probably won’t be great so I wouldn’t try for anything beyond uncommon (green) or rare (blue) quality job requests.</w:t>
+        <w:t xml:space="preserve">Complete Cleaning the Holy Fountain once with your diving gear equipped </w:t>
+      </w:r>
+      <w:r>
+        <w:rPr>
+          <w:rFonts w:ascii="Calibri" w:cs="Calibri" w:eastAsia="Calibri" w:hAnsi="Calibri"/>
+          <w:b w:val="1"/>
+          <w:bCs w:val="1"/>
+          <w:rtl w:val="0"/>
+        </w:rPr>
+        <w:t xml:space="preserve">[Normal Achievement 24]</w:t>
+      </w:r>
+      <w:r>
+        <w:rPr>
+          <w:rFonts w:ascii="Calibri" w:cs="Calibri" w:eastAsia="Calibri" w:hAnsi="Calibri"/>
+          <w:rtl w:val="0"/>
+        </w:rPr>
+        <w:t xml:space="preserve">, then with your normal gear on continue the activity until you find the ##Flame of Azura and ##Cold Embrace </w:t>
+      </w:r>
+      <w:r>
+        <w:rPr>
+          <w:rFonts w:ascii="Calibri" w:cs="Calibri" w:eastAsia="Calibri" w:hAnsi="Calibri"/>
+          <w:b w:val="1"/>
+          <w:bCs w:val="1"/>
+          <w:rtl w:val="0"/>
+        </w:rPr>
+        <w:t xml:space="preserve">[Collectibles 17,18]</w:t>
+      </w:r>
+      <w:r>
+        <w:rPr>
+          <w:rtl w:val="0"/>
+        </w:rPr>
       </w:r>
     </w:p>
     <w:p>
@@ -12022,93 +12376,23 @@
           <w:rFonts w:ascii="Calibri" w:cs="Calibri" w:eastAsia="Calibri" w:hAnsi="Calibri"/>
           <w:rtl w:val="0"/>
         </w:rPr>
-        <w:t xml:space="preserve">If you finish with all the jobs you can either bank steps for completing tomorrow’s jobs, or do Sledding in Nurturing Nook Springs for even more reputation (especially once you get the Zippy Kicksled at 80 rep)</w:t>
-      </w:r>
-    </w:p>
-    <w:p>
-      <w:pPr>
-        <w:numPr>
-          <w:ilvl w:val="0"/>
-          <w:numId w:val="2"/>
-        </w:numPr>
-        <w:spacing w:line="259" w:lineRule="auto"/>
-        <w:ind w:left="720" w:hanging="360"/>
-        <w:rPr>
-          <w:rFonts w:ascii="Calibri" w:cs="Calibri" w:eastAsia="Calibri" w:hAnsi="Calibri"/>
-        </w:rPr>
-      </w:pPr>
-      <w:r>
-        <w:rPr>
-          <w:rFonts w:ascii="Calibri" w:cs="Calibri" w:eastAsia="Calibri" w:hAnsi="Calibri"/>
-          <w:rtl w:val="0"/>
-        </w:rPr>
-        <w:t xml:space="preserve">Take your Hydrilium Diving set out of the bank, equip your best </w:t>
-      </w:r>
-      <w:r>
-        <w:rPr>
-          <w:rFonts w:ascii="Calibri" w:cs="Calibri" w:eastAsia="Calibri" w:hAnsi="Calibri"/>
-          <w:b w:val="1"/>
-          <w:bCs w:val="1"/>
-          <w:rtl w:val="0"/>
-        </w:rPr>
-        <w:t xml:space="preserve">Find Collectibles Net Fishing</w:t>
-      </w:r>
-      <w:r>
-        <w:rPr>
-          <w:rFonts w:ascii="Calibri" w:cs="Calibri" w:eastAsia="Calibri" w:hAnsi="Calibri"/>
-          <w:rtl w:val="0"/>
-        </w:rPr>
-        <w:t xml:space="preserve"> gear and go to Azurazera</w:t>
-      </w:r>
-    </w:p>
-    <w:p>
-      <w:pPr>
-        <w:numPr>
-          <w:ilvl w:val="0"/>
-          <w:numId w:val="2"/>
-        </w:numPr>
-        <w:spacing w:line="259" w:lineRule="auto"/>
-        <w:ind w:left="720" w:hanging="360"/>
-        <w:rPr>
-          <w:rFonts w:ascii="Calibri" w:cs="Calibri" w:eastAsia="Calibri" w:hAnsi="Calibri"/>
-        </w:rPr>
-      </w:pPr>
-      <w:r>
-        <w:rPr>
-          <w:rFonts w:ascii="Calibri" w:cs="Calibri" w:eastAsia="Calibri" w:hAnsi="Calibri"/>
-          <w:rtl w:val="0"/>
-        </w:rPr>
-        <w:t xml:space="preserve">Complete Cleaning the Holy Fountain once with your diving gear equipped </w:t>
-      </w:r>
-      <w:r>
-        <w:rPr>
-          <w:rFonts w:ascii="Calibri" w:cs="Calibri" w:eastAsia="Calibri" w:hAnsi="Calibri"/>
-          <w:b w:val="1"/>
-          <w:bCs w:val="1"/>
-          <w:rtl w:val="0"/>
-        </w:rPr>
-        <w:t xml:space="preserve">[Normal Achievement 23]</w:t>
-      </w:r>
-      <w:r>
-        <w:rPr>
-          <w:rFonts w:ascii="Calibri" w:cs="Calibri" w:eastAsia="Calibri" w:hAnsi="Calibri"/>
-          <w:rtl w:val="0"/>
-        </w:rPr>
-        <w:t xml:space="preserve">, then with your normal gear on continue the activity until you find the ##Flame of Azura and ##Cold Embrace </w:t>
-      </w:r>
-      <w:r>
-        <w:rPr>
-          <w:rFonts w:ascii="Calibri" w:cs="Calibri" w:eastAsia="Calibri" w:hAnsi="Calibri"/>
-          <w:b w:val="1"/>
-          <w:bCs w:val="1"/>
-          <w:rtl w:val="0"/>
-        </w:rPr>
-        <w:t xml:space="preserve">[Collectibles 17,18]</w:t>
-      </w:r>
-      <w:r>
-        <w:rPr>
-          <w:rtl w:val="0"/>
-        </w:rPr>
+        <w:t xml:space="preserve">Continue to to jobs while cleaning the fountain to hit 125 reputation which gives another collectible ##Sigil of the Ordained </w:t>
+      </w:r>
+      <w:r>
+        <w:rPr>
+          <w:rFonts w:ascii="Calibri" w:cs="Calibri" w:eastAsia="Calibri" w:hAnsi="Calibri"/>
+          <w:b w:val="1"/>
+          <w:bCs w:val="1"/>
+          <w:rtl w:val="0"/>
+        </w:rPr>
+        <w:t xml:space="preserve">[Collectible 19]</w:t>
+      </w:r>
+      <w:r>
+        <w:rPr>
+          <w:rFonts w:ascii="Calibri" w:cs="Calibri" w:eastAsia="Calibri" w:hAnsi="Calibri"/>
+          <w:rtl w:val="0"/>
+        </w:rPr>
+        <w:t xml:space="preserve"> at 125 rep.</w:t>
       </w:r>
     </w:p>
     <w:p>
@@ -12128,42 +12412,6 @@
           <w:rFonts w:ascii="Calibri" w:cs="Calibri" w:eastAsia="Calibri" w:hAnsi="Calibri"/>
           <w:rtl w:val="0"/>
         </w:rPr>
-        <w:t xml:space="preserve">Continue to to jobs while cleaning the fountain to hit 125 reputation which gives another collectible ##Sigil of the Ordained </w:t>
-      </w:r>
-      <w:r>
-        <w:rPr>
-          <w:rFonts w:ascii="Calibri" w:cs="Calibri" w:eastAsia="Calibri" w:hAnsi="Calibri"/>
-          <w:b w:val="1"/>
-          <w:bCs w:val="1"/>
-          <w:rtl w:val="0"/>
-        </w:rPr>
-        <w:t xml:space="preserve">[Collectible 19]</w:t>
-      </w:r>
-      <w:r>
-        <w:rPr>
-          <w:rFonts w:ascii="Calibri" w:cs="Calibri" w:eastAsia="Calibri" w:hAnsi="Calibri"/>
-          <w:rtl w:val="0"/>
-        </w:rPr>
-        <w:t xml:space="preserve"> at 125 rep.</w:t>
-      </w:r>
-    </w:p>
-    <w:p>
-      <w:pPr>
-        <w:numPr>
-          <w:ilvl w:val="1"/>
-          <w:numId w:val="2"/>
-        </w:numPr>
-        <w:spacing w:line="259" w:lineRule="auto"/>
-        <w:ind w:left="1440" w:hanging="360"/>
-        <w:rPr>
-          <w:rFonts w:ascii="Calibri" w:cs="Calibri" w:eastAsia="Calibri" w:hAnsi="Calibri"/>
-        </w:rPr>
-      </w:pPr>
-      <w:r>
-        <w:rPr>
-          <w:rFonts w:ascii="Calibri" w:cs="Calibri" w:eastAsia="Calibri" w:hAnsi="Calibri"/>
-          <w:rtl w:val="0"/>
-        </w:rPr>
         <w:t xml:space="preserve">I recommend getting all the way to 150 reputation as the new bank location at Azurazera is extremely helpful in the next section</w:t>
       </w:r>
     </w:p>
@@ -12222,9 +12470,9 @@
           <w:rFonts w:ascii="Calibri" w:cs="Calibri" w:eastAsia="Calibri" w:hAnsi="Calibri"/>
           <w:rtl w:val="0"/>
         </w:rPr>
-        <w:t xml:space="preserve">Achievements: 17/17 | 23/36 | 4/20 | 0/1</w:t>
+        <w:t xml:space="preserve">Achievements: 17/17 | 24/36 | 4/20 | 0/1</w:t>
         <w:br w:type="textWrapping"/>
-        <w:t xml:space="preserve">  Collectibles: 19/47 | Total Achievement Points: 115</w:t>
+        <w:t xml:space="preserve">  Collectibles: 19/47 | Total Achievement Points: 118</w:t>
         <w:br w:type="textWrapping"/>
         <w:t xml:space="preserve">  Agility: 60</w:t>
         <w:br w:type="textWrapping"/>
@@ -12251,6 +12499,19 @@
         <w:spacing w:after="160" w:line="259" w:lineRule="auto"/>
         <w:rPr>
           <w:rFonts w:ascii="Calibri" w:cs="Calibri" w:eastAsia="Calibri" w:hAnsi="Calibri"/>
+        </w:rPr>
+      </w:pPr>
+      <w:r>
+        <w:rPr>
+          <w:rtl w:val="0"/>
+        </w:rPr>
+      </w:r>
+    </w:p>
+    <w:p>
+      <w:pPr>
+        <w:spacing w:after="160" w:line="259" w:lineRule="auto"/>
+        <w:rPr>
+          <w:rFonts w:ascii="Calibri" w:cs="Calibri" w:eastAsia="Calibri" w:hAnsi="Calibri"/>
           <w:b w:val="1"/>
           <w:bCs w:val="1"/>
         </w:rPr>
@@ -12453,7 +12714,7 @@
           <w:bCs w:val="1"/>
           <w:rtl w:val="0"/>
         </w:rPr>
-        <w:t xml:space="preserve">[Normal Achievement 24]</w:t>
+        <w:t xml:space="preserve">[Normal Achievement 25]</w:t>
       </w:r>
       <w:r>
         <w:rPr>
@@ -12527,7 +12788,7 @@
           <w:bCs w:val="1"/>
           <w:rtl w:val="0"/>
         </w:rPr>
-        <w:t xml:space="preserve">[Normal Achievement 25]</w:t>
+        <w:t xml:space="preserve">[Normal Achievement 26]</w:t>
       </w:r>
       <w:r>
         <w:rPr>
@@ -12630,9 +12891,9 @@
           <w:rFonts w:ascii="Calibri" w:cs="Calibri" w:eastAsia="Calibri" w:hAnsi="Calibri"/>
           <w:rtl w:val="0"/>
         </w:rPr>
-        <w:t xml:space="preserve">Achievements: 17/17 | 25/36 | 4/20 | 0/1</w:t>
+        <w:t xml:space="preserve">Achievements: 17/17 | 26/36 | 4/20 | 0/1</w:t>
         <w:br w:type="textWrapping"/>
-        <w:t xml:space="preserve">  Collectibles: 19/47 | Total Achievement Points: 119</w:t>
+        <w:t xml:space="preserve">  Collectibles: 19/47 | Total Achievement Points: 122</w:t>
         <w:br w:type="textWrapping"/>
         <w:t xml:space="preserve">  Agility: 60</w:t>
         <w:br w:type="textWrapping"/>
@@ -12799,7 +13060,7 @@
           <w:bCs w:val="1"/>
           <w:rtl w:val="0"/>
         </w:rPr>
-        <w:t xml:space="preserve">[Normal Achievement 26]</w:t>
+        <w:t xml:space="preserve">[Normal Achievement 27]</w:t>
       </w:r>
       <w:r>
         <w:rPr>
@@ -12905,7 +13166,7 @@
           <w:bCs w:val="1"/>
           <w:rtl w:val="0"/>
         </w:rPr>
-        <w:t xml:space="preserve">[Collectible 20] [Normal Achievement 27]</w:t>
+        <w:t xml:space="preserve">[Collectible 20] [Normal Achievement 28]</w:t>
       </w:r>
       <w:r>
         <w:rPr>
@@ -13231,7 +13492,7 @@
           <w:bCs w:val="1"/>
           <w:rtl w:val="0"/>
         </w:rPr>
-        <w:t xml:space="preserve">[Normal Achievement 28]</w:t>
+        <w:t xml:space="preserve">[Normal Achievement 29]</w:t>
       </w:r>
       <w:r>
         <w:rPr>
@@ -13334,9 +13595,9 @@
           <w:rFonts w:ascii="Calibri" w:cs="Calibri" w:eastAsia="Calibri" w:hAnsi="Calibri"/>
           <w:rtl w:val="0"/>
         </w:rPr>
-        <w:t xml:space="preserve">Achievements: 17/17 | 28/36 | 6/20 | 0/1</w:t>
+        <w:t xml:space="preserve">Achievements: 17/17 | 29/36 | 6/20 | 0/1</w:t>
         <w:br w:type="textWrapping"/>
-        <w:t xml:space="preserve">  Collectibles: 21/47 | Total Achievement Points: 152 (Cape of Half-Achiever!)</w:t>
+        <w:t xml:space="preserve">  Collectibles: 21/47 | Total Achievement Points: 155 (Cape of Half-Achiever!)</w:t>
         <w:br w:type="textWrapping"/>
         <w:t xml:space="preserve">  Agility: 65</w:t>
         <w:br w:type="textWrapping"/>
@@ -13399,6 +13660,26 @@
           <w:rFonts w:ascii="Calibri" w:cs="Calibri" w:eastAsia="Calibri" w:hAnsi="Calibri"/>
           <w:rtl w:val="0"/>
         </w:rPr>
+        <w:t xml:space="preserve">While in Syrenthia, prioritize leveling your Dolphin until it reaches adulthood</w:t>
+      </w:r>
+    </w:p>
+    <w:p>
+      <w:pPr>
+        <w:numPr>
+          <w:ilvl w:val="0"/>
+          <w:numId w:val="20"/>
+        </w:numPr>
+        <w:spacing w:line="259" w:lineRule="auto"/>
+        <w:ind w:left="720" w:hanging="360"/>
+        <w:rPr>
+          <w:rFonts w:ascii="Noto Sans Symbols" w:cs="Noto Sans Symbols" w:eastAsia="Noto Sans Symbols" w:hAnsi="Noto Sans Symbols"/>
+        </w:rPr>
+      </w:pPr>
+      <w:r>
+        <w:rPr>
+          <w:rFonts w:ascii="Calibri" w:cs="Calibri" w:eastAsia="Calibri" w:hAnsi="Calibri"/>
+          <w:rtl w:val="0"/>
+        </w:rPr>
         <w:t xml:space="preserve">Continue to complete Syrenthia jobs and attempt to reach level 5 to unlock ##Mark of the Trident, ##Mark of the Serpent, and ##Mark of the Deep One </w:t>
       </w:r>
       <w:r>
@@ -13602,7 +13883,7 @@
           <w:bCs w:val="1"/>
           <w:rtl w:val="0"/>
         </w:rPr>
-        <w:t xml:space="preserve">[Normal Achievement 29]</w:t>
+        <w:t xml:space="preserve">[Normal Achievement 30]</w:t>
       </w:r>
       <w:r>
         <w:rPr>
@@ -13672,7 +13953,7 @@
           <w:bCs w:val="1"/>
           <w:rtl w:val="0"/>
         </w:rPr>
-        <w:t xml:space="preserve">[Normal Achievement 30]</w:t>
+        <w:t xml:space="preserve">[Normal Achievement 31]</w:t>
       </w:r>
       <w:r>
         <w:rPr>
@@ -13840,7 +14121,7 @@
           <w:rFonts w:ascii="Calibri" w:cs="Calibri" w:eastAsia="Calibri" w:hAnsi="Calibri"/>
           <w:rtl w:val="0"/>
         </w:rPr>
-        <w:t xml:space="preserve">Travel Northwest to Darktide Trench and do Predator Hunting (Spear) for the ##Anglerfish Mask </w:t>
+        <w:t xml:space="preserve">Travel Northwest to Darktide Trench and do Predator Fishing (Spear) for the ##Anglerfish Mask </w:t>
       </w:r>
       <w:r>
         <w:rPr>
@@ -14163,7 +14444,7 @@
           <w:bCs w:val="1"/>
           <w:rtl w:val="0"/>
         </w:rPr>
-        <w:t xml:space="preserve">[Normal Achievement 31]</w:t>
+        <w:t xml:space="preserve">[Normal Achievement 32]</w:t>
       </w:r>
       <w:r>
         <w:rPr>
@@ -14217,7 +14498,7 @@
           <w:bCs w:val="1"/>
           <w:rtl w:val="0"/>
         </w:rPr>
-        <w:t xml:space="preserve">[Normal Achievement 32]</w:t>
+        <w:t xml:space="preserve">[Normal Achievement 33]</w:t>
       </w:r>
       <w:r>
         <w:rPr>
@@ -14368,9 +14649,9 @@
           <w:rFonts w:ascii="Calibri" w:cs="Calibri" w:eastAsia="Calibri" w:hAnsi="Calibri"/>
           <w:rtl w:val="0"/>
         </w:rPr>
-        <w:t xml:space="preserve">  Achievements: 17/17 | 32/36 | 6/20 | 0/1</w:t>
+        <w:t xml:space="preserve">  Achievements: 17/17 | 33/36 | 6/20 | 0/1</w:t>
         <w:br w:type="textWrapping"/>
-        <w:t xml:space="preserve">  Collectibles: 27/47 | Total Achievement Points: 170</w:t>
+        <w:t xml:space="preserve">  Collectibles: 27/47 | Total Achievement Points: 173</w:t>
         <w:br w:type="textWrapping"/>
         <w:t xml:space="preserve">  Agility: 65</w:t>
         <w:br w:type="textWrapping"/>
@@ -15555,7 +15836,7 @@
           <w:bCs w:val="1"/>
           <w:rtl w:val="0"/>
         </w:rPr>
-        <w:t xml:space="preserve">[Normal Achievement 33]</w:t>
+        <w:t xml:space="preserve">[Normal Achievement 34]</w:t>
       </w:r>
       <w:r>
         <w:rPr>
@@ -15627,7 +15908,7 @@
           <w:bCs w:val="1"/>
           <w:rtl w:val="0"/>
         </w:rPr>
-        <w:t xml:space="preserve">[Normal Achievement 34] [Hard Achievement 16]</w:t>
+        <w:t xml:space="preserve">[Normal Achievement 35] [Hard Achievement 16]</w:t>
       </w:r>
       <w:r>
         <w:rPr>
@@ -16025,9 +16306,9 @@
           <w:rFonts w:ascii="Calibri" w:cs="Calibri" w:eastAsia="Calibri" w:hAnsi="Calibri"/>
           <w:rtl w:val="0"/>
         </w:rPr>
-        <w:t xml:space="preserve">  Achievements: 17/17 | 34/36 | 16/20 | 0/1</w:t>
+        <w:t xml:space="preserve">  Achievements: 17/17 | 35/36 | 16/20 | 0/1</w:t>
         <w:br w:type="textWrapping"/>
-        <w:t xml:space="preserve">  Collectibles: 29/47 | Total Achievement Points: 228</w:t>
+        <w:t xml:space="preserve">  Collectibles: 29/47 | Total Achievement Points: 231</w:t>
         <w:br w:type="textWrapping"/>
       </w:r>
     </w:p>
@@ -16267,7 +16548,7 @@
           <w:rFonts w:ascii="Calibri" w:cs="Calibri" w:eastAsia="Calibri" w:hAnsi="Calibri"/>
           <w:rtl w:val="0"/>
         </w:rPr>
-        <w:t xml:space="preserve"> gear, make Spectral Needles/Tailored Gear/Wrenches/Sickles/Hammers using normal Ectoplasm/Bones. Use the “Fine” Ectoplasm/Bones and Sweet Carrot Pies to make Spectral Pickaxes until you get an Eternal quality Spectral Pickaxe </w:t>
+        <w:t xml:space="preserve"> gear, make Spectral Needles/Tailored Gear/Wrenches/Sickles/Hammers/Flower Necklaces using normal Ectoplasm/Bones. Use the “Fine” Ectoplasm/Bones and Sweet Carrot Pies to make Spectral Pickaxes until you get an Eternal quality Spectral Pickaxe </w:t>
       </w:r>
       <w:r>
         <w:rPr>
@@ -16719,7 +17000,7 @@
           <w:bCs w:val="1"/>
           <w:rtl w:val="0"/>
         </w:rPr>
-        <w:t xml:space="preserve">[Normal Achievement 35]</w:t>
+        <w:t xml:space="preserve">[Normal Achievement 36]</w:t>
       </w:r>
       <w:r>
         <w:rPr>
@@ -16739,64 +17020,15 @@
         <w:ind w:left="720" w:hanging="360"/>
         <w:rPr>
           <w:rFonts w:ascii="Calibri" w:cs="Calibri" w:eastAsia="Calibri" w:hAnsi="Calibri"/>
-        </w:rPr>
-      </w:pPr>
-      <w:r>
-        <w:rPr>
-          <w:rFonts w:ascii="Calibri" w:cs="Calibri" w:eastAsia="Calibri" w:hAnsi="Calibri"/>
-          <w:rtl w:val="0"/>
-        </w:rPr>
-        <w:t xml:space="preserve">Using your best </w:t>
-      </w:r>
-      <w:r>
-        <w:rPr>
-          <w:rFonts w:ascii="Calibri" w:cs="Calibri" w:eastAsia="Calibri" w:hAnsi="Calibri"/>
-          <w:b w:val="1"/>
-          <w:bCs w:val="1"/>
-          <w:rtl w:val="0"/>
-        </w:rPr>
-        <w:t xml:space="preserve">No Materials/Double Rewards Tailoring</w:t>
-      </w:r>
-      <w:r>
-        <w:rPr>
-          <w:rFonts w:ascii="Calibri" w:cs="Calibri" w:eastAsia="Calibri" w:hAnsi="Calibri"/>
-          <w:rtl w:val="0"/>
-        </w:rPr>
-        <w:t xml:space="preserve"> gear create Tough Linen until you get a $$Mummy Egg  </w:t>
-      </w:r>
-      <w:r>
-        <w:rPr>
-          <w:rFonts w:ascii="Calibri" w:cs="Calibri" w:eastAsia="Calibri" w:hAnsi="Calibri"/>
-          <w:b w:val="1"/>
-          <w:bCs w:val="1"/>
-          <w:rtl w:val="0"/>
-        </w:rPr>
-        <w:t xml:space="preserve">[Normal Achievement 36]</w:t>
-      </w:r>
-      <w:r>
-        <w:rPr>
-          <w:rtl w:val="0"/>
-        </w:rPr>
-      </w:r>
-    </w:p>
-    <w:p>
-      <w:pPr>
-        <w:numPr>
-          <w:ilvl w:val="1"/>
-          <w:numId w:val="24"/>
-        </w:numPr>
-        <w:spacing w:line="259" w:lineRule="auto"/>
-        <w:ind w:left="1440" w:hanging="360"/>
-        <w:rPr>
-          <w:rFonts w:ascii="Calibri" w:cs="Calibri" w:eastAsia="Calibri" w:hAnsi="Calibri"/>
-        </w:rPr>
-      </w:pPr>
-      <w:r>
-        <w:rPr>
-          <w:rFonts w:ascii="Calibri" w:cs="Calibri" w:eastAsia="Calibri" w:hAnsi="Calibri"/>
-          <w:rtl w:val="0"/>
-        </w:rPr>
-        <w:t xml:space="preserve">If you don’t find a Mummy Egg the best bet is to bulk make Tatty Garb.</w:t>
+          <w:u w:val="none"/>
+        </w:rPr>
+      </w:pPr>
+      <w:r>
+        <w:rPr>
+          <w:rFonts w:ascii="Calibri" w:cs="Calibri" w:eastAsia="Calibri" w:hAnsi="Calibri"/>
+          <w:rtl w:val="0"/>
+        </w:rPr>
+        <w:t xml:space="preserve">While in Wrentmark you must keep your Camel equipped.</w:t>
       </w:r>
     </w:p>
     <w:p>
@@ -17097,6 +17329,32 @@
           <w:rtl w:val="0"/>
         </w:rPr>
         <w:t xml:space="preserve">There is no REAL order here, you can do these last few activities however you want</w:t>
+      </w:r>
+    </w:p>
+    <w:p>
+      <w:pPr>
+        <w:spacing w:line="259" w:lineRule="auto"/>
+        <w:rPr>
+          <w:rFonts w:ascii="Calibri" w:cs="Calibri" w:eastAsia="Calibri" w:hAnsi="Calibri"/>
+        </w:rPr>
+      </w:pPr>
+      <w:r>
+        <w:rPr>
+          <w:rtl w:val="0"/>
+        </w:rPr>
+      </w:r>
+    </w:p>
+    <w:p>
+      <w:pPr>
+        <w:spacing w:line="259" w:lineRule="auto"/>
+        <w:rPr>
+          <w:rFonts w:ascii="Calibri" w:cs="Calibri" w:eastAsia="Calibri" w:hAnsi="Calibri"/>
+        </w:rPr>
+      </w:pPr>
+      <w:r>
+        <w:rPr>
+          <w:rtl w:val="0"/>
+        </w:rPr>
       </w:r>
     </w:p>
     <w:p>

</xml_diff>